<commit_message>
docs: Thêm nội dung cho mục Yêu cầu chức năng
</commit_message>
<xml_diff>
--- a/Documents/9_REPORT_ApplicationDevelopment.docx
+++ b/Documents/9_REPORT_ApplicationDevelopment.docx
@@ -128,7 +128,7 @@
           </mc:Choice>
           <mc:Fallback>
             <w:pict>
-              <v:shapetype w14:anchorId="2CB6DCE9" id="_x0000_t32" coordsize="21600,21600" o:spt="32" o:oned="t" path="m,l21600,21600e" filled="f">
+              <v:shapetype w14:anchorId="2C750252" id="_x0000_t32" coordsize="21600,21600" o:spt="32" o:oned="t" path="m,l21600,21600e" filled="f">
                 <v:path arrowok="t" fillok="f" o:connecttype="none"/>
                 <o:lock v:ext="edit" shapetype="t"/>
               </v:shapetype>
@@ -5694,15 +5694,7 @@
         <w:spacing w:before="0" w:after="120" w:line="240" w:lineRule="auto"/>
       </w:pPr>
       <w:r>
-        <w:t xml:space="preserve">&lt;Giải thích cho </w:t>
-      </w:r>
-      <w:proofErr w:type="gramStart"/>
-      <w:r>
-        <w:t>các  thuật</w:t>
-      </w:r>
-      <w:proofErr w:type="gramEnd"/>
-      <w:r>
-        <w:t xml:space="preserve"> ngữ và từ viết tắt dùng trong tài liệu, các định nghĩa sử dụng trong tài liệu&gt;.</w:t>
+        <w:t>&lt;Giải thích cho các  thuật ngữ và từ viết tắt dùng trong tài liệu, các định nghĩa sử dụng trong tài liệu&gt;.</w:t>
       </w:r>
     </w:p>
     <w:tbl>
@@ -6781,35 +6773,259 @@
       </w:pPr>
       <w:bookmarkStart w:id="18" w:name="_Toc237374703"/>
       <w:r>
-        <w:t>Yêu vầu chức năng:</w:t>
-      </w:r>
+        <w:t xml:space="preserve">Yêu </w:t>
+      </w:r>
+      <w:r>
+        <w:t>c</w:t>
+      </w:r>
+      <w:r>
+        <w:t>ầu chức năng:</w:t>
+      </w:r>
+      <w:bookmarkStart w:id="19" w:name="_Toc237374704"/>
       <w:bookmarkEnd w:id="18"/>
     </w:p>
     <w:p>
-      <w:r>
-        <w:rPr>
-          <w:i/>
-          <w:color w:val="FF0000"/>
+      <w:pPr>
+        <w:pStyle w:val="Heading3"/>
+      </w:pPr>
+      <w:r>
+        <w:t>Yêu cầu chức năng</w:t>
+      </w:r>
+    </w:p>
+    <w:p>
+      <w:pPr>
+        <w:pStyle w:val="ListParagraph"/>
+        <w:ind w:left="284" w:firstLine="0"/>
+        <w:rPr>
           <w:szCs w:val="26"/>
         </w:rPr>
-        <w:t xml:space="preserve">Yêu cầu chức năng </w:t>
-      </w:r>
-      <w:r>
-        <w:rPr>
-          <w:i/>
-          <w:color w:val="FF0000"/>
+      </w:pPr>
+      <w:r>
+        <w:rPr>
           <w:szCs w:val="26"/>
         </w:rPr>
-        <w:t>của một hệ thống là quan trọng vì yêu cầu cung cấp các cơ sở cho tất cả công việc phát triển hệ thống sau đó.</w:t>
+        <w:t xml:space="preserve">Chức năng lưu trữ được xem là trọng tâm của hệ thống và là cơ sở để triển khai các chức năng quản lý, tìm kiếm, bán hàng và lập hóa đơn trong cửa hàng thú </w:t>
+      </w:r>
+      <w:r>
+        <w:rPr>
+          <w:szCs w:val="26"/>
+        </w:rPr>
+        <w:lastRenderedPageBreak/>
+        <w:t>cưng. Để đảm bảo quản lý dữ liệu đầy đủ, chính xác và thuận tiện, hệ thống cần lưu trữ các thông tin quan trọng sau:</w:t>
+      </w:r>
+    </w:p>
+    <w:p>
+      <w:pPr>
+        <w:pStyle w:val="ListParagraph"/>
+        <w:numPr>
+          <w:ilvl w:val="0"/>
+          <w:numId w:val="10"/>
+        </w:numPr>
+        <w:tabs>
+          <w:tab w:val="clear" w:pos="1350"/>
+          <w:tab w:val="num" w:pos="644"/>
+        </w:tabs>
+        <w:spacing w:before="0" w:after="160" w:line="278" w:lineRule="auto"/>
+        <w:ind w:left="644"/>
+        <w:rPr>
+          <w:szCs w:val="26"/>
+        </w:rPr>
+      </w:pPr>
+      <w:r>
+        <w:rPr>
+          <w:szCs w:val="26"/>
+        </w:rPr>
+        <w:t>Thông tin nhân viên: Mã nhân viên, họ và tên, ngày sinh, địa chỉ, email, số điện thoại, ngày vào làm, chức vụ, mức lương và ghi chú.</w:t>
+      </w:r>
+    </w:p>
+    <w:p>
+      <w:pPr>
+        <w:pStyle w:val="ListParagraph"/>
+        <w:numPr>
+          <w:ilvl w:val="0"/>
+          <w:numId w:val="10"/>
+        </w:numPr>
+        <w:tabs>
+          <w:tab w:val="clear" w:pos="1350"/>
+          <w:tab w:val="num" w:pos="644"/>
+        </w:tabs>
+        <w:spacing w:before="0" w:after="160" w:line="278" w:lineRule="auto"/>
+        <w:ind w:left="644"/>
+        <w:rPr>
+          <w:szCs w:val="26"/>
+        </w:rPr>
+      </w:pPr>
+      <w:r>
+        <w:rPr>
+          <w:szCs w:val="26"/>
+        </w:rPr>
+        <w:t>Thông tin thú cưng: Mã thú cưng, tên thú cưng, loại thú cưng, ngày tiếp nhận, giới tính, tuổi, mã khách hàng và ghi chú.</w:t>
+      </w:r>
+    </w:p>
+    <w:p>
+      <w:pPr>
+        <w:pStyle w:val="ListParagraph"/>
+        <w:numPr>
+          <w:ilvl w:val="0"/>
+          <w:numId w:val="10"/>
+        </w:numPr>
+        <w:tabs>
+          <w:tab w:val="clear" w:pos="1350"/>
+          <w:tab w:val="num" w:pos="644"/>
+        </w:tabs>
+        <w:spacing w:before="0" w:after="160" w:line="278" w:lineRule="auto"/>
+        <w:ind w:left="644"/>
+        <w:rPr>
+          <w:szCs w:val="26"/>
+        </w:rPr>
+      </w:pPr>
+      <w:r>
+        <w:rPr>
+          <w:szCs w:val="26"/>
+        </w:rPr>
+        <w:t>Thông tin khách hàng: Mã khách hàng, họ và tên, ngày sinh, địa chỉ, email, số điện thoại và ghi chú.</w:t>
+      </w:r>
+    </w:p>
+    <w:p>
+      <w:pPr>
+        <w:pStyle w:val="ListParagraph"/>
+        <w:numPr>
+          <w:ilvl w:val="0"/>
+          <w:numId w:val="10"/>
+        </w:numPr>
+        <w:tabs>
+          <w:tab w:val="clear" w:pos="1350"/>
+          <w:tab w:val="num" w:pos="644"/>
+        </w:tabs>
+        <w:spacing w:before="0" w:after="160" w:line="278" w:lineRule="auto"/>
+        <w:ind w:left="644"/>
+        <w:rPr>
+          <w:szCs w:val="26"/>
+        </w:rPr>
+      </w:pPr>
+      <w:r>
+        <w:rPr>
+          <w:szCs w:val="26"/>
+        </w:rPr>
+        <w:t>Thông tin sản phẩm: Mã sản phẩm, tên sản phẩm, loại sản phẩm, đơn vị tính, giá bán, số lượng tồn kho và ghi chú.</w:t>
+      </w:r>
+    </w:p>
+    <w:p>
+      <w:pPr>
+        <w:pStyle w:val="ListParagraph"/>
+        <w:numPr>
+          <w:ilvl w:val="0"/>
+          <w:numId w:val="10"/>
+        </w:numPr>
+        <w:tabs>
+          <w:tab w:val="clear" w:pos="1350"/>
+          <w:tab w:val="num" w:pos="644"/>
+        </w:tabs>
+        <w:spacing w:before="0" w:after="160" w:line="278" w:lineRule="auto"/>
+        <w:ind w:left="644"/>
+        <w:rPr>
+          <w:szCs w:val="26"/>
+        </w:rPr>
+      </w:pPr>
+      <w:r>
+        <w:rPr>
+          <w:szCs w:val="26"/>
+        </w:rPr>
+        <w:t>Thông tin dịch vụ chăm sóc: mã dịch vụ, tên dịch vụ, loại dịch vụ, giá dịch vụ, thời gian thực hiện và ghi chú.</w:t>
+      </w:r>
+    </w:p>
+    <w:p>
+      <w:pPr>
+        <w:pStyle w:val="ListParagraph"/>
+        <w:numPr>
+          <w:ilvl w:val="0"/>
+          <w:numId w:val="10"/>
+        </w:numPr>
+        <w:tabs>
+          <w:tab w:val="clear" w:pos="1350"/>
+          <w:tab w:val="num" w:pos="644"/>
+        </w:tabs>
+        <w:spacing w:before="0" w:after="160" w:line="278" w:lineRule="auto"/>
+        <w:ind w:left="644"/>
+        <w:rPr>
+          <w:szCs w:val="26"/>
+        </w:rPr>
+      </w:pPr>
+      <w:r>
+        <w:rPr>
+          <w:szCs w:val="26"/>
+        </w:rPr>
+        <w:t>Thông tin lịch hẹn: Mã lịch hẹn, mã khách hàng, thông tin thú cưng, ngày giờ hẹn, nội dung dịch vụ và trạng thái lịch hẹn.</w:t>
+      </w:r>
+    </w:p>
+    <w:p>
+      <w:pPr>
+        <w:pStyle w:val="ListParagraph"/>
+        <w:numPr>
+          <w:ilvl w:val="0"/>
+          <w:numId w:val="10"/>
+        </w:numPr>
+        <w:tabs>
+          <w:tab w:val="clear" w:pos="1350"/>
+          <w:tab w:val="num" w:pos="644"/>
+        </w:tabs>
+        <w:spacing w:before="0" w:after="160" w:line="278" w:lineRule="auto"/>
+        <w:ind w:left="644"/>
+        <w:rPr>
+          <w:szCs w:val="26"/>
+        </w:rPr>
+      </w:pPr>
+      <w:r>
+        <w:rPr>
+          <w:szCs w:val="26"/>
+        </w:rPr>
+        <w:t>Thông tin hóa đơn: Mã hóa đơn, ngày lập hóa đơn, mã khách hàng, mã nhân viên, chi tiết các sản phẩm hoặc thú cưng được mua, số lượng, đơn giá, thành tiền và tổng số tiền hóa đơn.</w:t>
+      </w:r>
+    </w:p>
+    <w:p>
+      <w:pPr>
+        <w:pStyle w:val="ListParagraph"/>
+        <w:numPr>
+          <w:ilvl w:val="0"/>
+          <w:numId w:val="10"/>
+        </w:numPr>
+        <w:tabs>
+          <w:tab w:val="clear" w:pos="1350"/>
+          <w:tab w:val="num" w:pos="644"/>
+        </w:tabs>
+        <w:spacing w:before="0" w:after="160" w:line="278" w:lineRule="auto"/>
+        <w:ind w:left="644"/>
+        <w:rPr>
+          <w:szCs w:val="26"/>
+        </w:rPr>
+      </w:pPr>
+      <w:r>
+        <w:rPr>
+          <w:szCs w:val="26"/>
+        </w:rPr>
+        <w:t>Thông tin tồn kho: Mã sản phẩm, số lượng nhập, số lượng xuất, số lượng tồn, ngày cập nhật và ghi chú.</w:t>
+      </w:r>
+    </w:p>
+    <w:p>
+      <w:pPr>
+        <w:pStyle w:val="ListParagraph"/>
+        <w:ind w:left="284"/>
+        <w:rPr>
+          <w:szCs w:val="26"/>
+        </w:rPr>
+      </w:pPr>
+      <w:r>
+        <w:rPr>
+          <w:szCs w:val="26"/>
+        </w:rPr>
+        <w:t>Các thông tin được lưu trữ có mối quan hệ với nhau, giúp hệ thống kiểm soát hoạt động bán hàng, quản lý nhân viên, khách hàng, thú cưng, sản phẩm, tồn kho và lịch hẹn một cách thống nhất.</w:t>
       </w:r>
     </w:p>
     <w:p>
       <w:pPr>
         <w:pStyle w:val="Heading2"/>
       </w:pPr>
-      <w:bookmarkStart w:id="19" w:name="_Toc237374704"/>
-      <w:r>
-        <w:lastRenderedPageBreak/>
+      <w:r>
         <w:t>Yêu cầu phi chức năng:</w:t>
       </w:r>
       <w:bookmarkEnd w:id="19"/>
@@ -7794,15 +8010,7 @@
         <w:ind w:left="0"/>
       </w:pPr>
       <w:r>
-        <w:t xml:space="preserve">&lt;Phần này mô tả một cách chi tiết từng yêu cầu cụ thể, cho phép các thành viên tham gia dự án căn cứ vào đó để xây dựng một phần mềm có chất lượng tốt nhất. Với cách tiếp cận theo mô hình UseCase (UC), các yêu cầu phần </w:t>
-      </w:r>
-      <w:proofErr w:type="gramStart"/>
-      <w:r>
-        <w:t>mềm  được</w:t>
-      </w:r>
-      <w:proofErr w:type="gramEnd"/>
-      <w:r>
-        <w:t xml:space="preserve"> mô tả theo các UC và trong các đặc tả bổ sung&gt;.</w:t>
+        <w:t>&lt;Phần này mô tả một cách chi tiết từng yêu cầu cụ thể, cho phép các thành viên tham gia dự án căn cứ vào đó để xây dựng một phần mềm có chất lượng tốt nhất. Với cách tiếp cận theo mô hình UseCase (UC), các yêu cầu phần mềm  được mô tả theo các UC và trong các đặc tả bổ sung&gt;.</w:t>
       </w:r>
     </w:p>
     <w:p>
@@ -8140,25 +8348,7 @@
                 <w:sz w:val="26"/>
                 <w:szCs w:val="26"/>
               </w:rPr>
-              <w:t xml:space="preserve">&lt;Kết quả thu được sau khi thực hiện đúng </w:t>
-            </w:r>
-            <w:proofErr w:type="gramStart"/>
-            <w:r>
-              <w:rPr>
-                <w:rFonts w:ascii="Times New Roman" w:hAnsi="Times New Roman"/>
-                <w:sz w:val="26"/>
-                <w:szCs w:val="26"/>
-              </w:rPr>
-              <w:t>&amp;  kết</w:t>
-            </w:r>
-            <w:proofErr w:type="gramEnd"/>
-            <w:r>
-              <w:rPr>
-                <w:rFonts w:ascii="Times New Roman" w:hAnsi="Times New Roman"/>
-                <w:sz w:val="26"/>
-                <w:szCs w:val="26"/>
-              </w:rPr>
-              <w:t xml:space="preserve"> thúc UseCase&gt;.</w:t>
+              <w:t>&lt;Kết quả thu được sau khi thực hiện đúng &amp;  kết thúc UseCase&gt;.</w:t>
             </w:r>
           </w:p>
         </w:tc>
@@ -8759,25 +8949,7 @@
                 <w:sz w:val="26"/>
                 <w:szCs w:val="26"/>
               </w:rPr>
-              <w:t xml:space="preserve">&lt;Kết quả thu được sau khi thực hiện đúng </w:t>
-            </w:r>
-            <w:proofErr w:type="gramStart"/>
-            <w:r>
-              <w:rPr>
-                <w:rFonts w:ascii="Times New Roman" w:hAnsi="Times New Roman"/>
-                <w:sz w:val="26"/>
-                <w:szCs w:val="26"/>
-              </w:rPr>
-              <w:t>&amp;  kết</w:t>
-            </w:r>
-            <w:proofErr w:type="gramEnd"/>
-            <w:r>
-              <w:rPr>
-                <w:rFonts w:ascii="Times New Roman" w:hAnsi="Times New Roman"/>
-                <w:sz w:val="26"/>
-                <w:szCs w:val="26"/>
-              </w:rPr>
-              <w:t xml:space="preserve"> thúc UseCase&gt;.</w:t>
+              <w:t>&lt;Kết quả thu được sau khi thực hiện đúng &amp;  kết thúc UseCase&gt;.</w:t>
             </w:r>
           </w:p>
         </w:tc>
@@ -9310,25 +9482,7 @@
                 <w:sz w:val="26"/>
                 <w:szCs w:val="26"/>
               </w:rPr>
-              <w:t xml:space="preserve">&lt;Kết quả thu được sau khi thực hiện đúng </w:t>
-            </w:r>
-            <w:proofErr w:type="gramStart"/>
-            <w:r>
-              <w:rPr>
-                <w:rFonts w:ascii="Times New Roman" w:hAnsi="Times New Roman"/>
-                <w:sz w:val="26"/>
-                <w:szCs w:val="26"/>
-              </w:rPr>
-              <w:t>&amp;  kết</w:t>
-            </w:r>
-            <w:proofErr w:type="gramEnd"/>
-            <w:r>
-              <w:rPr>
-                <w:rFonts w:ascii="Times New Roman" w:hAnsi="Times New Roman"/>
-                <w:sz w:val="26"/>
-                <w:szCs w:val="26"/>
-              </w:rPr>
-              <w:t xml:space="preserve"> thúc UseCase&gt;.</w:t>
+              <w:t>&lt;Kết quả thu được sau khi thực hiện đúng &amp;  kết thúc UseCase&gt;.</w:t>
             </w:r>
           </w:p>
         </w:tc>
@@ -11096,19 +11250,11 @@
                 <w:sz w:val="24"/>
               </w:rPr>
             </w:pPr>
-            <w:proofErr w:type="gramStart"/>
-            <w:r>
-              <w:rPr>
-                <w:sz w:val="24"/>
-              </w:rPr>
-              <w:t>setMaNV(</w:t>
-            </w:r>
-            <w:proofErr w:type="gramEnd"/>
-            <w:r>
-              <w:rPr>
-                <w:sz w:val="24"/>
-              </w:rPr>
-              <w:t>string manv)</w:t>
+            <w:r>
+              <w:rPr>
+                <w:sz w:val="24"/>
+              </w:rPr>
+              <w:t>setMaNV(string manv)</w:t>
             </w:r>
           </w:p>
         </w:tc>
@@ -11156,16 +11302,8 @@
               <w:rPr>
                 <w:sz w:val="24"/>
               </w:rPr>
-              <w:t>Phát sinh day số theo quy luật</w:t>
-            </w:r>
-            <w:proofErr w:type="gramStart"/>
-            <w:r>
-              <w:rPr>
-                <w:sz w:val="24"/>
-              </w:rPr>
-              <w:t>…..</w:t>
-            </w:r>
-            <w:proofErr w:type="gramEnd"/>
+              <w:t>Phát sinh day số theo quy luật…..</w:t>
+            </w:r>
           </w:p>
         </w:tc>
         <w:tc>
@@ -11233,19 +11371,11 @@
                 <w:sz w:val="24"/>
               </w:rPr>
             </w:pPr>
-            <w:proofErr w:type="gramStart"/>
-            <w:r>
-              <w:rPr>
-                <w:sz w:val="24"/>
-              </w:rPr>
-              <w:t>setHoTen(</w:t>
-            </w:r>
-            <w:proofErr w:type="gramEnd"/>
-            <w:r>
-              <w:rPr>
-                <w:sz w:val="24"/>
-              </w:rPr>
-              <w:t>string hoten)</w:t>
+            <w:r>
+              <w:rPr>
+                <w:sz w:val="24"/>
+              </w:rPr>
+              <w:t>setHoTen(string hoten)</w:t>
             </w:r>
           </w:p>
         </w:tc>
@@ -11363,19 +11493,11 @@
                 <w:sz w:val="24"/>
               </w:rPr>
             </w:pPr>
-            <w:proofErr w:type="gramStart"/>
-            <w:r>
-              <w:rPr>
-                <w:sz w:val="24"/>
-              </w:rPr>
-              <w:t>setNgaySinh(</w:t>
-            </w:r>
-            <w:proofErr w:type="gramEnd"/>
-            <w:r>
-              <w:rPr>
-                <w:sz w:val="24"/>
-              </w:rPr>
-              <w:t>datetime ngaysinh)</w:t>
+            <w:r>
+              <w:rPr>
+                <w:sz w:val="24"/>
+              </w:rPr>
+              <w:t>setNgaySinh(datetime ngaysinh)</w:t>
             </w:r>
           </w:p>
         </w:tc>
@@ -11493,19 +11615,11 @@
                 <w:sz w:val="24"/>
               </w:rPr>
             </w:pPr>
-            <w:proofErr w:type="gramStart"/>
-            <w:r>
-              <w:rPr>
-                <w:sz w:val="24"/>
-              </w:rPr>
-              <w:t>setDiaChi(</w:t>
-            </w:r>
-            <w:proofErr w:type="gramEnd"/>
-            <w:r>
-              <w:rPr>
-                <w:sz w:val="24"/>
-              </w:rPr>
-              <w:t>string diachi)</w:t>
+            <w:r>
+              <w:rPr>
+                <w:sz w:val="24"/>
+              </w:rPr>
+              <w:t>setDiaChi(string diachi)</w:t>
             </w:r>
           </w:p>
         </w:tc>
@@ -11611,19 +11725,11 @@
                 <w:sz w:val="24"/>
               </w:rPr>
             </w:pPr>
-            <w:proofErr w:type="gramStart"/>
-            <w:r>
-              <w:rPr>
-                <w:sz w:val="24"/>
-              </w:rPr>
-              <w:t>setNgayVaoLam(</w:t>
-            </w:r>
-            <w:proofErr w:type="gramEnd"/>
-            <w:r>
-              <w:rPr>
-                <w:sz w:val="24"/>
-              </w:rPr>
-              <w:t>datetime ngayvaolam)</w:t>
+            <w:r>
+              <w:rPr>
+                <w:sz w:val="24"/>
+              </w:rPr>
+              <w:t>setNgayVaoLam(datetime ngayvaolam)</w:t>
             </w:r>
           </w:p>
         </w:tc>
@@ -11735,19 +11841,11 @@
                 <w:sz w:val="24"/>
               </w:rPr>
             </w:pPr>
-            <w:proofErr w:type="gramStart"/>
-            <w:r>
-              <w:rPr>
-                <w:sz w:val="24"/>
-              </w:rPr>
-              <w:t>setTrinhDo(</w:t>
-            </w:r>
-            <w:proofErr w:type="gramEnd"/>
-            <w:r>
-              <w:rPr>
-                <w:sz w:val="24"/>
-              </w:rPr>
-              <w:t>string trinhdo)</w:t>
+            <w:r>
+              <w:rPr>
+                <w:sz w:val="24"/>
+              </w:rPr>
+              <w:t>setTrinhDo(string trinhdo)</w:t>
             </w:r>
           </w:p>
         </w:tc>
@@ -11853,19 +11951,11 @@
                 <w:sz w:val="24"/>
               </w:rPr>
             </w:pPr>
-            <w:proofErr w:type="gramStart"/>
-            <w:r>
-              <w:rPr>
-                <w:sz w:val="24"/>
-              </w:rPr>
-              <w:t>setHeSoLuong(</w:t>
-            </w:r>
-            <w:proofErr w:type="gramEnd"/>
-            <w:r>
-              <w:rPr>
-                <w:sz w:val="24"/>
-              </w:rPr>
-              <w:t>float hesoluong)</w:t>
+            <w:r>
+              <w:rPr>
+                <w:sz w:val="24"/>
+              </w:rPr>
+              <w:t>setHeSoLuong(float hesoluong)</w:t>
             </w:r>
           </w:p>
         </w:tc>
@@ -11983,19 +12073,11 @@
                 <w:sz w:val="24"/>
               </w:rPr>
             </w:pPr>
-            <w:proofErr w:type="gramStart"/>
-            <w:r>
-              <w:rPr>
-                <w:sz w:val="24"/>
-              </w:rPr>
-              <w:t>setLuongCanBan(</w:t>
-            </w:r>
-            <w:proofErr w:type="gramEnd"/>
-            <w:r>
-              <w:rPr>
-                <w:sz w:val="24"/>
-              </w:rPr>
-              <w:t>int luongcanban)</w:t>
+            <w:r>
+              <w:rPr>
+                <w:sz w:val="24"/>
+              </w:rPr>
+              <w:t>setLuongCanBan(int luongcanban)</w:t>
             </w:r>
           </w:p>
         </w:tc>
@@ -12070,21 +12152,7 @@
               <w:rPr>
                 <w:sz w:val="24"/>
               </w:rPr>
-              <w:t>Throw exception “Lương căn bản &gt;</w:t>
-            </w:r>
-            <w:proofErr w:type="gramStart"/>
-            <w:r>
-              <w:rPr>
-                <w:sz w:val="24"/>
-              </w:rPr>
-              <w:t>0  ”</w:t>
-            </w:r>
-            <w:proofErr w:type="gramEnd"/>
-            <w:r>
-              <w:rPr>
-                <w:sz w:val="24"/>
-              </w:rPr>
-              <w:t xml:space="preserve"> nếu tham số hesoluong không hợp lệ</w:t>
+              <w:t>Throw exception “Lương căn bản &gt;0  ” nếu tham số hesoluong không hợp lệ</w:t>
             </w:r>
           </w:p>
         </w:tc>
@@ -12295,23 +12363,7 @@
                 <w:b/>
                 <w:sz w:val="24"/>
               </w:rPr>
-              <w:t xml:space="preserve">Viết phương thức </w:t>
-            </w:r>
-            <w:proofErr w:type="gramStart"/>
-            <w:r>
-              <w:rPr>
-                <w:b/>
-                <w:sz w:val="24"/>
-              </w:rPr>
-              <w:t>toString(</w:t>
-            </w:r>
-            <w:proofErr w:type="gramEnd"/>
-            <w:r>
-              <w:rPr>
-                <w:b/>
-                <w:sz w:val="24"/>
-              </w:rPr>
-              <w:t>)</w:t>
+              <w:t>Viết phương thức toString()</w:t>
             </w:r>
           </w:p>
         </w:tc>
@@ -12478,7 +12530,7 @@
           <w:noProof/>
         </w:rPr>
         <w:drawing>
-          <wp:inline distT="0" distB="0" distL="0" distR="0" wp14:anchorId="7BB8721A" wp14:editId="4B12A78B">
+          <wp:inline distT="0" distB="0" distL="0" distR="0" wp14:anchorId="7BB8721A" wp14:editId="4E79BF03">
             <wp:extent cx="1639614" cy="589327"/>
             <wp:effectExtent l="0" t="0" r="0" b="0"/>
             <wp:docPr id="972141918" name="Picture 1"/>
@@ -12709,7 +12761,7 @@
           </mc:Choice>
           <mc:Fallback>
             <w:pict>
-              <v:rect w14:anchorId="20C4F5F6" id="Rectangle 10" o:spid="_x0000_s1026" style="position:absolute;margin-left:9.95pt;margin-top:157.05pt;width:47.5pt;height:19pt;z-index:251666432;visibility:visible;mso-wrap-style:square;mso-height-percent:0;mso-wrap-distance-left:9pt;mso-wrap-distance-top:0;mso-wrap-distance-right:9pt;mso-wrap-distance-bottom:0;mso-position-horizontal:absolute;mso-position-horizontal-relative:text;mso-position-vertical:absolute;mso-position-vertical-relative:text;mso-height-percent:0;mso-height-relative:margin;v-text-anchor:middle" o:gfxdata="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" fillcolor="#fabf8f [1945]" strokecolor="#243f60 [1604]" strokeweight="2pt"/>
+              <v:rect w14:anchorId="0AB64CB1" id="Rectangle 10" o:spid="_x0000_s1026" style="position:absolute;margin-left:9.95pt;margin-top:157.05pt;width:47.5pt;height:19pt;z-index:251666432;visibility:visible;mso-wrap-style:square;mso-height-percent:0;mso-wrap-distance-left:9pt;mso-wrap-distance-top:0;mso-wrap-distance-right:9pt;mso-wrap-distance-bottom:0;mso-position-horizontal:absolute;mso-position-horizontal-relative:text;mso-position-vertical:absolute;mso-position-vertical-relative:text;mso-height-percent:0;mso-height-relative:margin;v-text-anchor:middle" o:gfxdata="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" fillcolor="#fabf8f [1945]" strokecolor="#243f60 [1604]" strokeweight="2pt"/>
             </w:pict>
           </mc:Fallback>
         </mc:AlternateContent>
@@ -12783,7 +12835,7 @@
           </mc:Choice>
           <mc:Fallback>
             <w:pict>
-              <v:rect w14:anchorId="2DB37495" id="Rectangle 11" o:spid="_x0000_s1026" style="position:absolute;margin-left:10.25pt;margin-top:180.3pt;width:47.5pt;height:19pt;z-index:251667456;visibility:visible;mso-wrap-style:square;mso-height-percent:0;mso-wrap-distance-left:9pt;mso-wrap-distance-top:0;mso-wrap-distance-right:9pt;mso-wrap-distance-bottom:0;mso-position-horizontal:absolute;mso-position-horizontal-relative:text;mso-position-vertical:absolute;mso-position-vertical-relative:text;mso-height-percent:0;mso-height-relative:margin;v-text-anchor:middle" o:gfxdata="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" fillcolor="#c00000" strokecolor="#243f60 [1604]" strokeweight="2pt"/>
+              <v:rect w14:anchorId="39A83528" id="Rectangle 11" o:spid="_x0000_s1026" style="position:absolute;margin-left:10.25pt;margin-top:180.3pt;width:47.5pt;height:19pt;z-index:251667456;visibility:visible;mso-wrap-style:square;mso-height-percent:0;mso-wrap-distance-left:9pt;mso-wrap-distance-top:0;mso-wrap-distance-right:9pt;mso-wrap-distance-bottom:0;mso-position-horizontal:absolute;mso-position-horizontal-relative:text;mso-position-vertical:absolute;mso-position-vertical-relative:text;mso-height-percent:0;mso-height-relative:margin;v-text-anchor:middle" o:gfxdata="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" fillcolor="#c00000" strokecolor="#243f60 [1604]" strokeweight="2pt"/>
             </w:pict>
           </mc:Fallback>
         </mc:AlternateContent>
@@ -12859,7 +12911,7 @@
           </mc:Choice>
           <mc:Fallback>
             <w:pict>
-              <v:rect w14:anchorId="5B701D87" id="Rectangle 13" o:spid="_x0000_s1026" style="position:absolute;margin-left:10.3pt;margin-top:130.8pt;width:47.55pt;height:19pt;z-index:251668480;visibility:visible;mso-wrap-style:square;mso-height-percent:0;mso-wrap-distance-left:9pt;mso-wrap-distance-top:0;mso-wrap-distance-right:9pt;mso-wrap-distance-bottom:0;mso-position-horizontal:absolute;mso-position-horizontal-relative:text;mso-position-vertical:absolute;mso-position-vertical-relative:text;mso-height-percent:0;mso-height-relative:margin;v-text-anchor:middle" o:gfxdata="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" fillcolor="#365f91 [2404]" strokecolor="#243f60 [1604]" strokeweight="2pt"/>
+              <v:rect w14:anchorId="22146738" id="Rectangle 13" o:spid="_x0000_s1026" style="position:absolute;margin-left:10.3pt;margin-top:130.8pt;width:47.55pt;height:19pt;z-index:251668480;visibility:visible;mso-wrap-style:square;mso-height-percent:0;mso-wrap-distance-left:9pt;mso-wrap-distance-top:0;mso-wrap-distance-right:9pt;mso-wrap-distance-bottom:0;mso-position-horizontal:absolute;mso-position-horizontal-relative:text;mso-position-vertical:absolute;mso-position-vertical-relative:text;mso-height-percent:0;mso-height-relative:margin;v-text-anchor:middle" o:gfxdata="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" fillcolor="#365f91 [2404]" strokecolor="#243f60 [1604]" strokeweight="2pt"/>
             </w:pict>
           </mc:Fallback>
         </mc:AlternateContent>
@@ -13109,7 +13161,7 @@
           </mc:Choice>
           <mc:Fallback>
             <w:pict>
-              <v:rect w14:anchorId="5D591D2E" id="Rectangle 14" o:spid="_x0000_s1026" style="position:absolute;margin-left:127.45pt;margin-top:90.65pt;width:189.9pt;height:73.9pt;z-index:251664384;visibility:visible;mso-wrap-style:square;mso-wrap-distance-left:9pt;mso-wrap-distance-top:0;mso-wrap-distance-right:9pt;mso-wrap-distance-bottom:0;mso-position-horizontal:absolute;mso-position-horizontal-relative:text;mso-position-vertical:absolute;mso-position-vertical-relative:text;v-text-anchor:middle" o:gfxdata="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" filled="f" strokecolor="#f79646 [3209]" strokeweight="3pt"/>
+              <v:rect w14:anchorId="0ACB0CA2" id="Rectangle 14" o:spid="_x0000_s1026" style="position:absolute;margin-left:127.45pt;margin-top:90.65pt;width:189.9pt;height:73.9pt;z-index:251664384;visibility:visible;mso-wrap-style:square;mso-wrap-distance-left:9pt;mso-wrap-distance-top:0;mso-wrap-distance-right:9pt;mso-wrap-distance-bottom:0;mso-position-horizontal:absolute;mso-position-horizontal-relative:text;mso-position-vertical:absolute;mso-position-vertical-relative:text;v-text-anchor:middle" o:gfxdata="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" filled="f" strokecolor="#f79646 [3209]" strokeweight="3pt"/>
             </w:pict>
           </mc:Fallback>
         </mc:AlternateContent>
@@ -13651,7 +13703,7 @@
           </mc:Choice>
           <mc:Fallback>
             <w:pict>
-              <v:shapetype w14:anchorId="0D582D64" id="_x0000_t88" coordsize="21600,21600" o:spt="88" adj="1800,10800" path="m,qx10800@0l10800@2qy21600@11,10800@3l10800@1qy,21600e" filled="f">
+              <v:shapetype w14:anchorId="56B0BCF0" id="_x0000_t88" coordsize="21600,21600" o:spt="88" adj="1800,10800" path="m,qx10800@0l10800@2qy21600@11,10800@3l10800@1qy,21600e" filled="f">
                 <v:formulas>
                   <v:f eqn="val #0"/>
                   <v:f eqn="sum 21600 0 #0"/>
@@ -13863,17 +13915,8 @@
           <w:sz w:val="22"/>
           <w:szCs w:val="22"/>
         </w:rPr>
-        <w:t>: màn hình ………</w:t>
-      </w:r>
-      <w:proofErr w:type="gramStart"/>
-      <w:r>
-        <w:rPr>
-          <w:sz w:val="22"/>
-          <w:szCs w:val="22"/>
-        </w:rPr>
-        <w:t>…..</w:t>
-      </w:r>
-      <w:proofErr w:type="gramEnd"/>
+        <w:t>: màn hình …………..</w:t>
+      </w:r>
     </w:p>
     <w:p>
       <w:pPr>
@@ -14306,29 +14349,7 @@
           <w:sz w:val="28"/>
           <w:szCs w:val="28"/>
         </w:rPr>
-        <w:t xml:space="preserve">Em là sinh viên khoa CNTT, nhận thấy yêu cầu về ứng dụng CNTT trong xã hội rất lớn và em (hoặc kết hợp với nhóm bạn) thành lập công ty </w:t>
-      </w:r>
-      <w:proofErr w:type="gramStart"/>
-      <w:r>
-        <w:rPr>
-          <w:i/>
-          <w:iCs/>
-          <w:color w:val="548DD4" w:themeColor="text2" w:themeTint="99"/>
-          <w:sz w:val="28"/>
-          <w:szCs w:val="28"/>
-        </w:rPr>
-        <w:t>để  phát</w:t>
-      </w:r>
-      <w:proofErr w:type="gramEnd"/>
-      <w:r>
-        <w:rPr>
-          <w:i/>
-          <w:iCs/>
-          <w:color w:val="548DD4" w:themeColor="text2" w:themeTint="99"/>
-          <w:sz w:val="28"/>
-          <w:szCs w:val="28"/>
-        </w:rPr>
-        <w:t xml:space="preserve"> triển dự án khởi nghiệp</w:t>
+        <w:t>Em là sinh viên khoa CNTT, nhận thấy yêu cầu về ứng dụng CNTT trong xã hội rất lớn và em (hoặc kết hợp với nhóm bạn) thành lập công ty để  phát triển dự án khởi nghiệp</w:t>
       </w:r>
       <w:r>
         <w:rPr>
@@ -14541,13 +14562,8 @@
     </w:p>
     <w:p>
       <w:r>
-        <w:t xml:space="preserve">- Tài liệu không có tên tác giả: xếp thứ tự theo bảng chữ cái đối với từ đầu tiên của tên cơ quan đã ấn hành tài liệu, ví dụ: Viện Khoa học Việt nam xếp vào vần V, Trung tâm Chọn Giống Lúa vần </w:t>
-      </w:r>
-      <w:proofErr w:type="gramStart"/>
-      <w:r>
-        <w:t>T,..</w:t>
-      </w:r>
-      <w:proofErr w:type="gramEnd"/>
+        <w:t>- Tài liệu không có tên tác giả: xếp thứ tự theo bảng chữ cái đối với từ đầu tiên của tên cơ quan đã ấn hành tài liệu, ví dụ: Viện Khoa học Việt nam xếp vào vần V, Trung tâm Chọn Giống Lúa vần T,..</w:t>
+      </w:r>
     </w:p>
     <w:p>
       <w:r>
@@ -14556,15 +14572,7 @@
     </w:p>
     <w:p>
       <w:r>
-        <w:t xml:space="preserve">- </w:t>
-      </w:r>
-      <w:proofErr w:type="gramStart"/>
-      <w:r>
-        <w:t>tên các tác giả (có dấu phẩy ngăn cách giữa các tên tác giả</w:t>
-      </w:r>
-      <w:proofErr w:type="gramEnd"/>
-      <w:r>
-        <w:t>)</w:t>
+        <w:t>- tên các tác giả (có dấu phẩy ngăn cách giữa các tên tác giả)</w:t>
       </w:r>
     </w:p>
     <w:p>
@@ -14687,7 +14695,7 @@
           <w:noProof/>
         </w:rPr>
         <w:drawing>
-          <wp:inline distT="0" distB="0" distL="0" distR="0" wp14:anchorId="5CE39CCD" wp14:editId="66D66CA3">
+          <wp:inline distT="0" distB="0" distL="0" distR="0" wp14:anchorId="5CE39CCD" wp14:editId="0E6B892A">
             <wp:extent cx="5580380" cy="3687445"/>
             <wp:effectExtent l="0" t="0" r="0" b="0"/>
             <wp:docPr id="2" name="Picture 2" descr="A close-up of a document&#10;&#10;Description automatically generated"/>
@@ -15214,6 +15222,155 @@
     </w:lvl>
   </w:abstractNum>
   <w:abstractNum w:abstractNumId="1" w15:restartNumberingAfterBreak="0">
+    <w:nsid w:val="1D667D23"/>
+    <w:multiLevelType w:val="multilevel"/>
+    <w:tmpl w:val="2E0E5654"/>
+    <w:lvl w:ilvl="0">
+      <w:start w:val="1"/>
+      <w:numFmt w:val="bullet"/>
+      <w:lvlText w:val="-"/>
+      <w:lvlJc w:val="left"/>
+      <w:pPr>
+        <w:tabs>
+          <w:tab w:val="num" w:pos="1350"/>
+        </w:tabs>
+        <w:ind w:left="1350" w:hanging="360"/>
+      </w:pPr>
+      <w:rPr>
+        <w:rFonts w:ascii="Times New Roman" w:eastAsia="Times New Roman" w:hAnsi="Times New Roman" w:cs="Times New Roman" w:hint="default"/>
+        <w:sz w:val="20"/>
+      </w:rPr>
+    </w:lvl>
+    <w:lvl w:ilvl="1" w:tentative="1">
+      <w:start w:val="1"/>
+      <w:numFmt w:val="bullet"/>
+      <w:lvlText w:val="o"/>
+      <w:lvlJc w:val="left"/>
+      <w:pPr>
+        <w:tabs>
+          <w:tab w:val="num" w:pos="2070"/>
+        </w:tabs>
+        <w:ind w:left="2070" w:hanging="360"/>
+      </w:pPr>
+      <w:rPr>
+        <w:rFonts w:ascii="Courier New" w:hAnsi="Courier New" w:hint="default"/>
+        <w:sz w:val="20"/>
+      </w:rPr>
+    </w:lvl>
+    <w:lvl w:ilvl="2" w:tentative="1">
+      <w:start w:val="1"/>
+      <w:numFmt w:val="bullet"/>
+      <w:lvlText w:val=""/>
+      <w:lvlJc w:val="left"/>
+      <w:pPr>
+        <w:tabs>
+          <w:tab w:val="num" w:pos="2790"/>
+        </w:tabs>
+        <w:ind w:left="2790" w:hanging="360"/>
+      </w:pPr>
+      <w:rPr>
+        <w:rFonts w:ascii="Wingdings" w:hAnsi="Wingdings" w:hint="default"/>
+        <w:sz w:val="20"/>
+      </w:rPr>
+    </w:lvl>
+    <w:lvl w:ilvl="3" w:tentative="1">
+      <w:start w:val="1"/>
+      <w:numFmt w:val="bullet"/>
+      <w:lvlText w:val=""/>
+      <w:lvlJc w:val="left"/>
+      <w:pPr>
+        <w:tabs>
+          <w:tab w:val="num" w:pos="3510"/>
+        </w:tabs>
+        <w:ind w:left="3510" w:hanging="360"/>
+      </w:pPr>
+      <w:rPr>
+        <w:rFonts w:ascii="Wingdings" w:hAnsi="Wingdings" w:hint="default"/>
+        <w:sz w:val="20"/>
+      </w:rPr>
+    </w:lvl>
+    <w:lvl w:ilvl="4" w:tentative="1">
+      <w:start w:val="1"/>
+      <w:numFmt w:val="bullet"/>
+      <w:lvlText w:val=""/>
+      <w:lvlJc w:val="left"/>
+      <w:pPr>
+        <w:tabs>
+          <w:tab w:val="num" w:pos="4230"/>
+        </w:tabs>
+        <w:ind w:left="4230" w:hanging="360"/>
+      </w:pPr>
+      <w:rPr>
+        <w:rFonts w:ascii="Wingdings" w:hAnsi="Wingdings" w:hint="default"/>
+        <w:sz w:val="20"/>
+      </w:rPr>
+    </w:lvl>
+    <w:lvl w:ilvl="5" w:tentative="1">
+      <w:start w:val="1"/>
+      <w:numFmt w:val="bullet"/>
+      <w:lvlText w:val=""/>
+      <w:lvlJc w:val="left"/>
+      <w:pPr>
+        <w:tabs>
+          <w:tab w:val="num" w:pos="4950"/>
+        </w:tabs>
+        <w:ind w:left="4950" w:hanging="360"/>
+      </w:pPr>
+      <w:rPr>
+        <w:rFonts w:ascii="Wingdings" w:hAnsi="Wingdings" w:hint="default"/>
+        <w:sz w:val="20"/>
+      </w:rPr>
+    </w:lvl>
+    <w:lvl w:ilvl="6" w:tentative="1">
+      <w:start w:val="1"/>
+      <w:numFmt w:val="bullet"/>
+      <w:lvlText w:val=""/>
+      <w:lvlJc w:val="left"/>
+      <w:pPr>
+        <w:tabs>
+          <w:tab w:val="num" w:pos="5670"/>
+        </w:tabs>
+        <w:ind w:left="5670" w:hanging="360"/>
+      </w:pPr>
+      <w:rPr>
+        <w:rFonts w:ascii="Wingdings" w:hAnsi="Wingdings" w:hint="default"/>
+        <w:sz w:val="20"/>
+      </w:rPr>
+    </w:lvl>
+    <w:lvl w:ilvl="7" w:tentative="1">
+      <w:start w:val="1"/>
+      <w:numFmt w:val="bullet"/>
+      <w:lvlText w:val=""/>
+      <w:lvlJc w:val="left"/>
+      <w:pPr>
+        <w:tabs>
+          <w:tab w:val="num" w:pos="6390"/>
+        </w:tabs>
+        <w:ind w:left="6390" w:hanging="360"/>
+      </w:pPr>
+      <w:rPr>
+        <w:rFonts w:ascii="Wingdings" w:hAnsi="Wingdings" w:hint="default"/>
+        <w:sz w:val="20"/>
+      </w:rPr>
+    </w:lvl>
+    <w:lvl w:ilvl="8" w:tentative="1">
+      <w:start w:val="1"/>
+      <w:numFmt w:val="bullet"/>
+      <w:lvlText w:val=""/>
+      <w:lvlJc w:val="left"/>
+      <w:pPr>
+        <w:tabs>
+          <w:tab w:val="num" w:pos="7110"/>
+        </w:tabs>
+        <w:ind w:left="7110" w:hanging="360"/>
+      </w:pPr>
+      <w:rPr>
+        <w:rFonts w:ascii="Wingdings" w:hAnsi="Wingdings" w:hint="default"/>
+        <w:sz w:val="20"/>
+      </w:rPr>
+    </w:lvl>
+  </w:abstractNum>
+  <w:abstractNum w:abstractNumId="2" w15:restartNumberingAfterBreak="0">
     <w:nsid w:val="46E6266F"/>
     <w:multiLevelType w:val="hybridMultilevel"/>
     <w:tmpl w:val="9A2E648C"/>
@@ -15326,7 +15483,7 @@
       </w:rPr>
     </w:lvl>
   </w:abstractNum>
-  <w:abstractNum w:abstractNumId="2" w15:restartNumberingAfterBreak="0">
+  <w:abstractNum w:abstractNumId="3" w15:restartNumberingAfterBreak="0">
     <w:nsid w:val="4D5C098A"/>
     <w:multiLevelType w:val="hybridMultilevel"/>
     <w:tmpl w:val="95985ECE"/>
@@ -15417,7 +15574,7 @@
       </w:pPr>
     </w:lvl>
   </w:abstractNum>
-  <w:abstractNum w:abstractNumId="3" w15:restartNumberingAfterBreak="0">
+  <w:abstractNum w:abstractNumId="4" w15:restartNumberingAfterBreak="0">
     <w:nsid w:val="678F230B"/>
     <w:multiLevelType w:val="hybridMultilevel"/>
     <w:tmpl w:val="D4F2EBBE"/>
@@ -15508,7 +15665,7 @@
       </w:pPr>
     </w:lvl>
   </w:abstractNum>
-  <w:abstractNum w:abstractNumId="4" w15:restartNumberingAfterBreak="0">
+  <w:abstractNum w:abstractNumId="5" w15:restartNumberingAfterBreak="0">
     <w:nsid w:val="772815DD"/>
     <w:multiLevelType w:val="hybridMultilevel"/>
     <w:tmpl w:val="D4626B72"/>
@@ -15621,10 +15778,10 @@
     </w:lvl>
   </w:abstractNum>
   <w:num w:numId="1" w16cid:durableId="2021348451">
-    <w:abstractNumId w:val="2"/>
+    <w:abstractNumId w:val="3"/>
   </w:num>
   <w:num w:numId="2" w16cid:durableId="591088944">
-    <w:abstractNumId w:val="3"/>
+    <w:abstractNumId w:val="4"/>
   </w:num>
   <w:num w:numId="3" w16cid:durableId="941257521">
     <w:abstractNumId w:val="0"/>
@@ -15750,9 +15907,12 @@
     </w:lvlOverride>
   </w:num>
   <w:num w:numId="8" w16cid:durableId="1277642441">
-    <w:abstractNumId w:val="4"/>
+    <w:abstractNumId w:val="5"/>
   </w:num>
   <w:num w:numId="9" w16cid:durableId="913590838">
+    <w:abstractNumId w:val="2"/>
+  </w:num>
+  <w:num w:numId="10" w16cid:durableId="590701889">
     <w:abstractNumId w:val="1"/>
   </w:num>
   <w:numIdMacAtCleanup w:val="9"/>

</xml_diff>

<commit_message>
docs: Thêm nội dung cho Yêu cầu chức năng
</commit_message>
<xml_diff>
--- a/Documents/9_REPORT_ApplicationDevelopment.docx
+++ b/Documents/9_REPORT_ApplicationDevelopment.docx
@@ -128,7 +128,7 @@
           </mc:Choice>
           <mc:Fallback>
             <w:pict>
-              <v:shapetype w14:anchorId="2CB6DCE9" id="_x0000_t32" coordsize="21600,21600" o:spt="32" o:oned="t" path="m,l21600,21600e" filled="f">
+              <v:shapetype w14:anchorId="317E92EE" id="_x0000_t32" coordsize="21600,21600" o:spt="32" o:oned="t" path="m,l21600,21600e" filled="f">
                 <v:path arrowok="t" fillok="f" o:connecttype="none"/>
                 <o:lock v:ext="edit" shapetype="t"/>
               </v:shapetype>
@@ -6781,35 +6781,259 @@
       </w:pPr>
       <w:bookmarkStart w:id="18" w:name="_Toc237374703"/>
       <w:r>
-        <w:t>Yêu vầu chức năng:</w:t>
-      </w:r>
+        <w:t xml:space="preserve">Yêu </w:t>
+      </w:r>
+      <w:r>
+        <w:t>c</w:t>
+      </w:r>
+      <w:r>
+        <w:t>ầu chức năng:</w:t>
+      </w:r>
+      <w:bookmarkStart w:id="19" w:name="_Toc237374704"/>
       <w:bookmarkEnd w:id="18"/>
     </w:p>
     <w:p>
-      <w:r>
-        <w:rPr>
-          <w:i/>
-          <w:color w:val="FF0000"/>
+      <w:pPr>
+        <w:pStyle w:val="Heading3"/>
+      </w:pPr>
+      <w:r>
+        <w:t>Yêu cầu chức năng</w:t>
+      </w:r>
+    </w:p>
+    <w:p>
+      <w:pPr>
+        <w:pStyle w:val="ListParagraph"/>
+        <w:ind w:left="284" w:firstLine="0"/>
+        <w:rPr>
           <w:szCs w:val="26"/>
         </w:rPr>
-        <w:t xml:space="preserve">Yêu cầu chức năng </w:t>
-      </w:r>
-      <w:r>
-        <w:rPr>
-          <w:i/>
-          <w:color w:val="FF0000"/>
+      </w:pPr>
+      <w:r>
+        <w:rPr>
           <w:szCs w:val="26"/>
         </w:rPr>
-        <w:t>của một hệ thống là quan trọng vì yêu cầu cung cấp các cơ sở cho tất cả công việc phát triển hệ thống sau đó.</w:t>
+        <w:t xml:space="preserve">Chức năng lưu trữ được xem là trọng tâm của hệ thống và là cơ sở để triển khai các chức năng quản lý, tìm kiếm, bán hàng và lập hóa đơn trong cửa hàng thú </w:t>
+      </w:r>
+      <w:r>
+        <w:rPr>
+          <w:szCs w:val="26"/>
+        </w:rPr>
+        <w:lastRenderedPageBreak/>
+        <w:t>cưng. Để đảm bảo quản lý dữ liệu đầy đủ, chính xác và thuận tiện, hệ thống cần lưu trữ các thông tin quan trọng sau:</w:t>
+      </w:r>
+    </w:p>
+    <w:p>
+      <w:pPr>
+        <w:pStyle w:val="ListParagraph"/>
+        <w:numPr>
+          <w:ilvl w:val="0"/>
+          <w:numId w:val="10"/>
+        </w:numPr>
+        <w:tabs>
+          <w:tab w:val="clear" w:pos="1350"/>
+          <w:tab w:val="num" w:pos="644"/>
+        </w:tabs>
+        <w:spacing w:before="0" w:after="160" w:line="278" w:lineRule="auto"/>
+        <w:ind w:left="644"/>
+        <w:rPr>
+          <w:szCs w:val="26"/>
+        </w:rPr>
+      </w:pPr>
+      <w:r>
+        <w:rPr>
+          <w:szCs w:val="26"/>
+        </w:rPr>
+        <w:t>Thông tin nhân viên: Mã nhân viên, họ và tên, ngày sinh, địa chỉ, email, số điện thoại, ngày vào làm, chức vụ, mức lương và ghi chú.</w:t>
+      </w:r>
+    </w:p>
+    <w:p>
+      <w:pPr>
+        <w:pStyle w:val="ListParagraph"/>
+        <w:numPr>
+          <w:ilvl w:val="0"/>
+          <w:numId w:val="10"/>
+        </w:numPr>
+        <w:tabs>
+          <w:tab w:val="clear" w:pos="1350"/>
+          <w:tab w:val="num" w:pos="644"/>
+        </w:tabs>
+        <w:spacing w:before="0" w:after="160" w:line="278" w:lineRule="auto"/>
+        <w:ind w:left="644"/>
+        <w:rPr>
+          <w:szCs w:val="26"/>
+        </w:rPr>
+      </w:pPr>
+      <w:r>
+        <w:rPr>
+          <w:szCs w:val="26"/>
+        </w:rPr>
+        <w:t>Thông tin thú cưng: Mã thú cưng, tên thú cưng, loại thú cưng, ngày tiếp nhận, giới tính, tuổi, mã khách hàng và ghi chú.</w:t>
+      </w:r>
+    </w:p>
+    <w:p>
+      <w:pPr>
+        <w:pStyle w:val="ListParagraph"/>
+        <w:numPr>
+          <w:ilvl w:val="0"/>
+          <w:numId w:val="10"/>
+        </w:numPr>
+        <w:tabs>
+          <w:tab w:val="clear" w:pos="1350"/>
+          <w:tab w:val="num" w:pos="644"/>
+        </w:tabs>
+        <w:spacing w:before="0" w:after="160" w:line="278" w:lineRule="auto"/>
+        <w:ind w:left="644"/>
+        <w:rPr>
+          <w:szCs w:val="26"/>
+        </w:rPr>
+      </w:pPr>
+      <w:r>
+        <w:rPr>
+          <w:szCs w:val="26"/>
+        </w:rPr>
+        <w:t>Thông tin khách hàng: Mã khách hàng, họ và tên, ngày sinh, địa chỉ, email, số điện thoại và ghi chú.</w:t>
+      </w:r>
+    </w:p>
+    <w:p>
+      <w:pPr>
+        <w:pStyle w:val="ListParagraph"/>
+        <w:numPr>
+          <w:ilvl w:val="0"/>
+          <w:numId w:val="10"/>
+        </w:numPr>
+        <w:tabs>
+          <w:tab w:val="clear" w:pos="1350"/>
+          <w:tab w:val="num" w:pos="644"/>
+        </w:tabs>
+        <w:spacing w:before="0" w:after="160" w:line="278" w:lineRule="auto"/>
+        <w:ind w:left="644"/>
+        <w:rPr>
+          <w:szCs w:val="26"/>
+        </w:rPr>
+      </w:pPr>
+      <w:r>
+        <w:rPr>
+          <w:szCs w:val="26"/>
+        </w:rPr>
+        <w:t>Thông tin sản phẩm: Mã sản phẩm, tên sản phẩm, loại sản phẩm, đơn vị tính, giá bán, số lượng tồn kho và ghi chú.</w:t>
+      </w:r>
+    </w:p>
+    <w:p>
+      <w:pPr>
+        <w:pStyle w:val="ListParagraph"/>
+        <w:numPr>
+          <w:ilvl w:val="0"/>
+          <w:numId w:val="10"/>
+        </w:numPr>
+        <w:tabs>
+          <w:tab w:val="clear" w:pos="1350"/>
+          <w:tab w:val="num" w:pos="644"/>
+        </w:tabs>
+        <w:spacing w:before="0" w:after="160" w:line="278" w:lineRule="auto"/>
+        <w:ind w:left="644"/>
+        <w:rPr>
+          <w:szCs w:val="26"/>
+        </w:rPr>
+      </w:pPr>
+      <w:r>
+        <w:rPr>
+          <w:szCs w:val="26"/>
+        </w:rPr>
+        <w:t>Thông tin dịch vụ chăm sóc: mã dịch vụ, tên dịch vụ, loại dịch vụ, giá dịch vụ, thời gian thực hiện và ghi chú.</w:t>
+      </w:r>
+    </w:p>
+    <w:p>
+      <w:pPr>
+        <w:pStyle w:val="ListParagraph"/>
+        <w:numPr>
+          <w:ilvl w:val="0"/>
+          <w:numId w:val="10"/>
+        </w:numPr>
+        <w:tabs>
+          <w:tab w:val="clear" w:pos="1350"/>
+          <w:tab w:val="num" w:pos="644"/>
+        </w:tabs>
+        <w:spacing w:before="0" w:after="160" w:line="278" w:lineRule="auto"/>
+        <w:ind w:left="644"/>
+        <w:rPr>
+          <w:szCs w:val="26"/>
+        </w:rPr>
+      </w:pPr>
+      <w:r>
+        <w:rPr>
+          <w:szCs w:val="26"/>
+        </w:rPr>
+        <w:t>Thông tin lịch hẹn: Mã lịch hẹn, mã khách hàng, thông tin thú cưng, ngày giờ hẹn, nội dung dịch vụ và trạng thái lịch hẹn.</w:t>
+      </w:r>
+    </w:p>
+    <w:p>
+      <w:pPr>
+        <w:pStyle w:val="ListParagraph"/>
+        <w:numPr>
+          <w:ilvl w:val="0"/>
+          <w:numId w:val="10"/>
+        </w:numPr>
+        <w:tabs>
+          <w:tab w:val="clear" w:pos="1350"/>
+          <w:tab w:val="num" w:pos="644"/>
+        </w:tabs>
+        <w:spacing w:before="0" w:after="160" w:line="278" w:lineRule="auto"/>
+        <w:ind w:left="644"/>
+        <w:rPr>
+          <w:szCs w:val="26"/>
+        </w:rPr>
+      </w:pPr>
+      <w:r>
+        <w:rPr>
+          <w:szCs w:val="26"/>
+        </w:rPr>
+        <w:t>Thông tin hóa đơn: Mã hóa đơn, ngày lập hóa đơn, mã khách hàng, mã nhân viên, chi tiết các sản phẩm hoặc thú cưng được mua, số lượng, đơn giá, thành tiền và tổng số tiền hóa đơn.</w:t>
+      </w:r>
+    </w:p>
+    <w:p>
+      <w:pPr>
+        <w:pStyle w:val="ListParagraph"/>
+        <w:numPr>
+          <w:ilvl w:val="0"/>
+          <w:numId w:val="10"/>
+        </w:numPr>
+        <w:tabs>
+          <w:tab w:val="clear" w:pos="1350"/>
+          <w:tab w:val="num" w:pos="644"/>
+        </w:tabs>
+        <w:spacing w:before="0" w:after="160" w:line="278" w:lineRule="auto"/>
+        <w:ind w:left="644"/>
+        <w:rPr>
+          <w:szCs w:val="26"/>
+        </w:rPr>
+      </w:pPr>
+      <w:r>
+        <w:rPr>
+          <w:szCs w:val="26"/>
+        </w:rPr>
+        <w:t>Thông tin tồn kho: Mã sản phẩm, số lượng nhập, số lượng xuất, số lượng tồn, ngày cập nhật và ghi chú.</w:t>
+      </w:r>
+    </w:p>
+    <w:p>
+      <w:pPr>
+        <w:pStyle w:val="ListParagraph"/>
+        <w:ind w:left="284"/>
+        <w:rPr>
+          <w:szCs w:val="26"/>
+        </w:rPr>
+      </w:pPr>
+      <w:r>
+        <w:rPr>
+          <w:szCs w:val="26"/>
+        </w:rPr>
+        <w:t>Các thông tin được lưu trữ có mối quan hệ với nhau, giúp hệ thống kiểm soát hoạt động bán hàng, quản lý nhân viên, khách hàng, thú cưng, sản phẩm, tồn kho và lịch hẹn một cách thống nhất.</w:t>
       </w:r>
     </w:p>
     <w:p>
       <w:pPr>
         <w:pStyle w:val="Heading2"/>
       </w:pPr>
-      <w:bookmarkStart w:id="19" w:name="_Toc237374704"/>
-      <w:r>
-        <w:lastRenderedPageBreak/>
+      <w:r>
         <w:t>Yêu cầu phi chức năng:</w:t>
       </w:r>
       <w:bookmarkEnd w:id="19"/>
@@ -12478,7 +12702,7 @@
           <w:noProof/>
         </w:rPr>
         <w:drawing>
-          <wp:inline distT="0" distB="0" distL="0" distR="0" wp14:anchorId="7BB8721A" wp14:editId="4B12A78B">
+          <wp:inline distT="0" distB="0" distL="0" distR="0" wp14:anchorId="7BB8721A" wp14:editId="06CFE1D5">
             <wp:extent cx="1639614" cy="589327"/>
             <wp:effectExtent l="0" t="0" r="0" b="0"/>
             <wp:docPr id="972141918" name="Picture 1"/>
@@ -12709,7 +12933,7 @@
           </mc:Choice>
           <mc:Fallback>
             <w:pict>
-              <v:rect w14:anchorId="20C4F5F6" id="Rectangle 10" o:spid="_x0000_s1026" style="position:absolute;margin-left:9.95pt;margin-top:157.05pt;width:47.5pt;height:19pt;z-index:251666432;visibility:visible;mso-wrap-style:square;mso-height-percent:0;mso-wrap-distance-left:9pt;mso-wrap-distance-top:0;mso-wrap-distance-right:9pt;mso-wrap-distance-bottom:0;mso-position-horizontal:absolute;mso-position-horizontal-relative:text;mso-position-vertical:absolute;mso-position-vertical-relative:text;mso-height-percent:0;mso-height-relative:margin;v-text-anchor:middle" o:gfxdata="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" fillcolor="#fabf8f [1945]" strokecolor="#243f60 [1604]" strokeweight="2pt"/>
+              <v:rect w14:anchorId="16EB3420" id="Rectangle 10" o:spid="_x0000_s1026" style="position:absolute;margin-left:9.95pt;margin-top:157.05pt;width:47.5pt;height:19pt;z-index:251666432;visibility:visible;mso-wrap-style:square;mso-height-percent:0;mso-wrap-distance-left:9pt;mso-wrap-distance-top:0;mso-wrap-distance-right:9pt;mso-wrap-distance-bottom:0;mso-position-horizontal:absolute;mso-position-horizontal-relative:text;mso-position-vertical:absolute;mso-position-vertical-relative:text;mso-height-percent:0;mso-height-relative:margin;v-text-anchor:middle" o:gfxdata="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" fillcolor="#fabf8f [1945]" strokecolor="#243f60 [1604]" strokeweight="2pt"/>
             </w:pict>
           </mc:Fallback>
         </mc:AlternateContent>
@@ -12783,7 +13007,7 @@
           </mc:Choice>
           <mc:Fallback>
             <w:pict>
-              <v:rect w14:anchorId="2DB37495" id="Rectangle 11" o:spid="_x0000_s1026" style="position:absolute;margin-left:10.25pt;margin-top:180.3pt;width:47.5pt;height:19pt;z-index:251667456;visibility:visible;mso-wrap-style:square;mso-height-percent:0;mso-wrap-distance-left:9pt;mso-wrap-distance-top:0;mso-wrap-distance-right:9pt;mso-wrap-distance-bottom:0;mso-position-horizontal:absolute;mso-position-horizontal-relative:text;mso-position-vertical:absolute;mso-position-vertical-relative:text;mso-height-percent:0;mso-height-relative:margin;v-text-anchor:middle" o:gfxdata="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" fillcolor="#c00000" strokecolor="#243f60 [1604]" strokeweight="2pt"/>
+              <v:rect w14:anchorId="5CB6DCAC" id="Rectangle 11" o:spid="_x0000_s1026" style="position:absolute;margin-left:10.25pt;margin-top:180.3pt;width:47.5pt;height:19pt;z-index:251667456;visibility:visible;mso-wrap-style:square;mso-height-percent:0;mso-wrap-distance-left:9pt;mso-wrap-distance-top:0;mso-wrap-distance-right:9pt;mso-wrap-distance-bottom:0;mso-position-horizontal:absolute;mso-position-horizontal-relative:text;mso-position-vertical:absolute;mso-position-vertical-relative:text;mso-height-percent:0;mso-height-relative:margin;v-text-anchor:middle" o:gfxdata="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" fillcolor="#c00000" strokecolor="#243f60 [1604]" strokeweight="2pt"/>
             </w:pict>
           </mc:Fallback>
         </mc:AlternateContent>
@@ -12859,7 +13083,7 @@
           </mc:Choice>
           <mc:Fallback>
             <w:pict>
-              <v:rect w14:anchorId="5B701D87" id="Rectangle 13" o:spid="_x0000_s1026" style="position:absolute;margin-left:10.3pt;margin-top:130.8pt;width:47.55pt;height:19pt;z-index:251668480;visibility:visible;mso-wrap-style:square;mso-height-percent:0;mso-wrap-distance-left:9pt;mso-wrap-distance-top:0;mso-wrap-distance-right:9pt;mso-wrap-distance-bottom:0;mso-position-horizontal:absolute;mso-position-horizontal-relative:text;mso-position-vertical:absolute;mso-position-vertical-relative:text;mso-height-percent:0;mso-height-relative:margin;v-text-anchor:middle" o:gfxdata="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" fillcolor="#365f91 [2404]" strokecolor="#243f60 [1604]" strokeweight="2pt"/>
+              <v:rect w14:anchorId="085287E8" id="Rectangle 13" o:spid="_x0000_s1026" style="position:absolute;margin-left:10.3pt;margin-top:130.8pt;width:47.55pt;height:19pt;z-index:251668480;visibility:visible;mso-wrap-style:square;mso-height-percent:0;mso-wrap-distance-left:9pt;mso-wrap-distance-top:0;mso-wrap-distance-right:9pt;mso-wrap-distance-bottom:0;mso-position-horizontal:absolute;mso-position-horizontal-relative:text;mso-position-vertical:absolute;mso-position-vertical-relative:text;mso-height-percent:0;mso-height-relative:margin;v-text-anchor:middle" o:gfxdata="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" fillcolor="#365f91 [2404]" strokecolor="#243f60 [1604]" strokeweight="2pt"/>
             </w:pict>
           </mc:Fallback>
         </mc:AlternateContent>
@@ -13109,7 +13333,7 @@
           </mc:Choice>
           <mc:Fallback>
             <w:pict>
-              <v:rect w14:anchorId="5D591D2E" id="Rectangle 14" o:spid="_x0000_s1026" style="position:absolute;margin-left:127.45pt;margin-top:90.65pt;width:189.9pt;height:73.9pt;z-index:251664384;visibility:visible;mso-wrap-style:square;mso-wrap-distance-left:9pt;mso-wrap-distance-top:0;mso-wrap-distance-right:9pt;mso-wrap-distance-bottom:0;mso-position-horizontal:absolute;mso-position-horizontal-relative:text;mso-position-vertical:absolute;mso-position-vertical-relative:text;v-text-anchor:middle" o:gfxdata="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" filled="f" strokecolor="#f79646 [3209]" strokeweight="3pt"/>
+              <v:rect w14:anchorId="18F26F5C" id="Rectangle 14" o:spid="_x0000_s1026" style="position:absolute;margin-left:127.45pt;margin-top:90.65pt;width:189.9pt;height:73.9pt;z-index:251664384;visibility:visible;mso-wrap-style:square;mso-wrap-distance-left:9pt;mso-wrap-distance-top:0;mso-wrap-distance-right:9pt;mso-wrap-distance-bottom:0;mso-position-horizontal:absolute;mso-position-horizontal-relative:text;mso-position-vertical:absolute;mso-position-vertical-relative:text;v-text-anchor:middle" o:gfxdata="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" filled="f" strokecolor="#f79646 [3209]" strokeweight="3pt"/>
             </w:pict>
           </mc:Fallback>
         </mc:AlternateContent>
@@ -13651,7 +13875,7 @@
           </mc:Choice>
           <mc:Fallback>
             <w:pict>
-              <v:shapetype w14:anchorId="0D582D64" id="_x0000_t88" coordsize="21600,21600" o:spt="88" adj="1800,10800" path="m,qx10800@0l10800@2qy21600@11,10800@3l10800@1qy,21600e" filled="f">
+              <v:shapetype w14:anchorId="41BD13E7" id="_x0000_t88" coordsize="21600,21600" o:spt="88" adj="1800,10800" path="m,qx10800@0l10800@2qy21600@11,10800@3l10800@1qy,21600e" filled="f">
                 <v:formulas>
                   <v:f eqn="val #0"/>
                   <v:f eqn="sum 21600 0 #0"/>
@@ -14687,7 +14911,7 @@
           <w:noProof/>
         </w:rPr>
         <w:drawing>
-          <wp:inline distT="0" distB="0" distL="0" distR="0" wp14:anchorId="5CE39CCD" wp14:editId="66D66CA3">
+          <wp:inline distT="0" distB="0" distL="0" distR="0" wp14:anchorId="5CE39CCD" wp14:editId="03985A61">
             <wp:extent cx="5580380" cy="3687445"/>
             <wp:effectExtent l="0" t="0" r="0" b="0"/>
             <wp:docPr id="2" name="Picture 2" descr="A close-up of a document&#10;&#10;Description automatically generated"/>
@@ -15214,6 +15438,155 @@
     </w:lvl>
   </w:abstractNum>
   <w:abstractNum w:abstractNumId="1" w15:restartNumberingAfterBreak="0">
+    <w:nsid w:val="1D667D23"/>
+    <w:multiLevelType w:val="multilevel"/>
+    <w:tmpl w:val="2E0E5654"/>
+    <w:lvl w:ilvl="0">
+      <w:start w:val="1"/>
+      <w:numFmt w:val="bullet"/>
+      <w:lvlText w:val="-"/>
+      <w:lvlJc w:val="left"/>
+      <w:pPr>
+        <w:tabs>
+          <w:tab w:val="num" w:pos="1350"/>
+        </w:tabs>
+        <w:ind w:left="1350" w:hanging="360"/>
+      </w:pPr>
+      <w:rPr>
+        <w:rFonts w:ascii="Times New Roman" w:eastAsia="Times New Roman" w:hAnsi="Times New Roman" w:cs="Times New Roman" w:hint="default"/>
+        <w:sz w:val="20"/>
+      </w:rPr>
+    </w:lvl>
+    <w:lvl w:ilvl="1" w:tentative="1">
+      <w:start w:val="1"/>
+      <w:numFmt w:val="bullet"/>
+      <w:lvlText w:val="o"/>
+      <w:lvlJc w:val="left"/>
+      <w:pPr>
+        <w:tabs>
+          <w:tab w:val="num" w:pos="2070"/>
+        </w:tabs>
+        <w:ind w:left="2070" w:hanging="360"/>
+      </w:pPr>
+      <w:rPr>
+        <w:rFonts w:ascii="Courier New" w:hAnsi="Courier New" w:hint="default"/>
+        <w:sz w:val="20"/>
+      </w:rPr>
+    </w:lvl>
+    <w:lvl w:ilvl="2" w:tentative="1">
+      <w:start w:val="1"/>
+      <w:numFmt w:val="bullet"/>
+      <w:lvlText w:val=""/>
+      <w:lvlJc w:val="left"/>
+      <w:pPr>
+        <w:tabs>
+          <w:tab w:val="num" w:pos="2790"/>
+        </w:tabs>
+        <w:ind w:left="2790" w:hanging="360"/>
+      </w:pPr>
+      <w:rPr>
+        <w:rFonts w:ascii="Wingdings" w:hAnsi="Wingdings" w:hint="default"/>
+        <w:sz w:val="20"/>
+      </w:rPr>
+    </w:lvl>
+    <w:lvl w:ilvl="3" w:tentative="1">
+      <w:start w:val="1"/>
+      <w:numFmt w:val="bullet"/>
+      <w:lvlText w:val=""/>
+      <w:lvlJc w:val="left"/>
+      <w:pPr>
+        <w:tabs>
+          <w:tab w:val="num" w:pos="3510"/>
+        </w:tabs>
+        <w:ind w:left="3510" w:hanging="360"/>
+      </w:pPr>
+      <w:rPr>
+        <w:rFonts w:ascii="Wingdings" w:hAnsi="Wingdings" w:hint="default"/>
+        <w:sz w:val="20"/>
+      </w:rPr>
+    </w:lvl>
+    <w:lvl w:ilvl="4" w:tentative="1">
+      <w:start w:val="1"/>
+      <w:numFmt w:val="bullet"/>
+      <w:lvlText w:val=""/>
+      <w:lvlJc w:val="left"/>
+      <w:pPr>
+        <w:tabs>
+          <w:tab w:val="num" w:pos="4230"/>
+        </w:tabs>
+        <w:ind w:left="4230" w:hanging="360"/>
+      </w:pPr>
+      <w:rPr>
+        <w:rFonts w:ascii="Wingdings" w:hAnsi="Wingdings" w:hint="default"/>
+        <w:sz w:val="20"/>
+      </w:rPr>
+    </w:lvl>
+    <w:lvl w:ilvl="5" w:tentative="1">
+      <w:start w:val="1"/>
+      <w:numFmt w:val="bullet"/>
+      <w:lvlText w:val=""/>
+      <w:lvlJc w:val="left"/>
+      <w:pPr>
+        <w:tabs>
+          <w:tab w:val="num" w:pos="4950"/>
+        </w:tabs>
+        <w:ind w:left="4950" w:hanging="360"/>
+      </w:pPr>
+      <w:rPr>
+        <w:rFonts w:ascii="Wingdings" w:hAnsi="Wingdings" w:hint="default"/>
+        <w:sz w:val="20"/>
+      </w:rPr>
+    </w:lvl>
+    <w:lvl w:ilvl="6" w:tentative="1">
+      <w:start w:val="1"/>
+      <w:numFmt w:val="bullet"/>
+      <w:lvlText w:val=""/>
+      <w:lvlJc w:val="left"/>
+      <w:pPr>
+        <w:tabs>
+          <w:tab w:val="num" w:pos="5670"/>
+        </w:tabs>
+        <w:ind w:left="5670" w:hanging="360"/>
+      </w:pPr>
+      <w:rPr>
+        <w:rFonts w:ascii="Wingdings" w:hAnsi="Wingdings" w:hint="default"/>
+        <w:sz w:val="20"/>
+      </w:rPr>
+    </w:lvl>
+    <w:lvl w:ilvl="7" w:tentative="1">
+      <w:start w:val="1"/>
+      <w:numFmt w:val="bullet"/>
+      <w:lvlText w:val=""/>
+      <w:lvlJc w:val="left"/>
+      <w:pPr>
+        <w:tabs>
+          <w:tab w:val="num" w:pos="6390"/>
+        </w:tabs>
+        <w:ind w:left="6390" w:hanging="360"/>
+      </w:pPr>
+      <w:rPr>
+        <w:rFonts w:ascii="Wingdings" w:hAnsi="Wingdings" w:hint="default"/>
+        <w:sz w:val="20"/>
+      </w:rPr>
+    </w:lvl>
+    <w:lvl w:ilvl="8" w:tentative="1">
+      <w:start w:val="1"/>
+      <w:numFmt w:val="bullet"/>
+      <w:lvlText w:val=""/>
+      <w:lvlJc w:val="left"/>
+      <w:pPr>
+        <w:tabs>
+          <w:tab w:val="num" w:pos="7110"/>
+        </w:tabs>
+        <w:ind w:left="7110" w:hanging="360"/>
+      </w:pPr>
+      <w:rPr>
+        <w:rFonts w:ascii="Wingdings" w:hAnsi="Wingdings" w:hint="default"/>
+        <w:sz w:val="20"/>
+      </w:rPr>
+    </w:lvl>
+  </w:abstractNum>
+  <w:abstractNum w:abstractNumId="2" w15:restartNumberingAfterBreak="0">
     <w:nsid w:val="46E6266F"/>
     <w:multiLevelType w:val="hybridMultilevel"/>
     <w:tmpl w:val="9A2E648C"/>
@@ -15326,7 +15699,7 @@
       </w:rPr>
     </w:lvl>
   </w:abstractNum>
-  <w:abstractNum w:abstractNumId="2" w15:restartNumberingAfterBreak="0">
+  <w:abstractNum w:abstractNumId="3" w15:restartNumberingAfterBreak="0">
     <w:nsid w:val="4D5C098A"/>
     <w:multiLevelType w:val="hybridMultilevel"/>
     <w:tmpl w:val="95985ECE"/>
@@ -15417,7 +15790,7 @@
       </w:pPr>
     </w:lvl>
   </w:abstractNum>
-  <w:abstractNum w:abstractNumId="3" w15:restartNumberingAfterBreak="0">
+  <w:abstractNum w:abstractNumId="4" w15:restartNumberingAfterBreak="0">
     <w:nsid w:val="678F230B"/>
     <w:multiLevelType w:val="hybridMultilevel"/>
     <w:tmpl w:val="D4F2EBBE"/>
@@ -15508,7 +15881,7 @@
       </w:pPr>
     </w:lvl>
   </w:abstractNum>
-  <w:abstractNum w:abstractNumId="4" w15:restartNumberingAfterBreak="0">
+  <w:abstractNum w:abstractNumId="5" w15:restartNumberingAfterBreak="0">
     <w:nsid w:val="772815DD"/>
     <w:multiLevelType w:val="hybridMultilevel"/>
     <w:tmpl w:val="D4626B72"/>
@@ -15621,10 +15994,10 @@
     </w:lvl>
   </w:abstractNum>
   <w:num w:numId="1" w16cid:durableId="2021348451">
-    <w:abstractNumId w:val="2"/>
+    <w:abstractNumId w:val="3"/>
   </w:num>
   <w:num w:numId="2" w16cid:durableId="591088944">
-    <w:abstractNumId w:val="3"/>
+    <w:abstractNumId w:val="4"/>
   </w:num>
   <w:num w:numId="3" w16cid:durableId="941257521">
     <w:abstractNumId w:val="0"/>
@@ -15750,9 +16123,12 @@
     </w:lvlOverride>
   </w:num>
   <w:num w:numId="8" w16cid:durableId="1277642441">
-    <w:abstractNumId w:val="4"/>
+    <w:abstractNumId w:val="5"/>
   </w:num>
   <w:num w:numId="9" w16cid:durableId="913590838">
+    <w:abstractNumId w:val="2"/>
+  </w:num>
+  <w:num w:numId="10" w16cid:durableId="590701889">
     <w:abstractNumId w:val="1"/>
   </w:num>
   <w:numIdMacAtCleanup w:val="9"/>

</xml_diff>

<commit_message>
docs: Thêm nội dung Yêu cầu về tính năng cho mục Yêu cầu chức năng
</commit_message>
<xml_diff>
--- a/Documents/9_REPORT_ApplicationDevelopment.docx
+++ b/Documents/9_REPORT_ApplicationDevelopment.docx
@@ -128,7 +128,7 @@
           </mc:Choice>
           <mc:Fallback>
             <w:pict>
-              <v:shapetype w14:anchorId="2C750252" id="_x0000_t32" coordsize="21600,21600" o:spt="32" o:oned="t" path="m,l21600,21600e" filled="f">
+              <v:shapetype w14:anchorId="75677679" id="_x0000_t32" coordsize="21600,21600" o:spt="32" o:oned="t" path="m,l21600,21600e" filled="f">
                 <v:path arrowok="t" fillok="f" o:connecttype="none"/>
                 <o:lock v:ext="edit" shapetype="t"/>
               </v:shapetype>
@@ -5694,7 +5694,15 @@
         <w:spacing w:before="0" w:after="120" w:line="240" w:lineRule="auto"/>
       </w:pPr>
       <w:r>
-        <w:t>&lt;Giải thích cho các  thuật ngữ và từ viết tắt dùng trong tài liệu, các định nghĩa sử dụng trong tài liệu&gt;.</w:t>
+        <w:t xml:space="preserve">&lt;Giải thích cho </w:t>
+      </w:r>
+      <w:proofErr w:type="gramStart"/>
+      <w:r>
+        <w:t>các  thuật</w:t>
+      </w:r>
+      <w:proofErr w:type="gramEnd"/>
+      <w:r>
+        <w:t xml:space="preserve"> ngữ và từ viết tắt dùng trong tài liệu, các định nghĩa sử dụng trong tài liệu&gt;.</w:t>
       </w:r>
     </w:p>
     <w:tbl>
@@ -6789,7 +6797,10 @@
         <w:pStyle w:val="Heading3"/>
       </w:pPr>
       <w:r>
-        <w:t>Yêu cầu chức năng</w:t>
+        <w:t xml:space="preserve">Yêu cầu </w:t>
+      </w:r>
+      <w:r>
+        <w:t>về lưu trữ</w:t>
       </w:r>
     </w:p>
     <w:p>
@@ -7009,7 +7020,7 @@
     <w:p>
       <w:pPr>
         <w:pStyle w:val="ListParagraph"/>
-        <w:ind w:left="284"/>
+        <w:ind w:left="284" w:firstLine="0"/>
         <w:rPr>
           <w:szCs w:val="26"/>
         </w:rPr>
@@ -7023,6 +7034,467 @@
     </w:p>
     <w:p>
       <w:pPr>
+        <w:pStyle w:val="Heading3"/>
+      </w:pPr>
+      <w:r>
+        <w:t>Yêu cầu về tính năng</w:t>
+      </w:r>
+    </w:p>
+    <w:p>
+      <w:pPr>
+        <w:pStyle w:val="ListParagraph"/>
+        <w:ind w:left="284" w:firstLine="0"/>
+        <w:rPr>
+          <w:szCs w:val="26"/>
+        </w:rPr>
+      </w:pPr>
+      <w:r>
+        <w:rPr>
+          <w:szCs w:val="26"/>
+        </w:rPr>
+        <w:t>Ngoài chức năng lưu trữ, hệ thống cần đáp ứng các yêu cầu về tính năng sau:</w:t>
+      </w:r>
+    </w:p>
+    <w:p>
+      <w:pPr>
+        <w:pStyle w:val="ListParagraph"/>
+        <w:numPr>
+          <w:ilvl w:val="0"/>
+          <w:numId w:val="11"/>
+        </w:numPr>
+        <w:tabs>
+          <w:tab w:val="clear" w:pos="1350"/>
+          <w:tab w:val="num" w:pos="644"/>
+        </w:tabs>
+        <w:spacing w:before="0" w:after="160" w:line="278" w:lineRule="auto"/>
+        <w:ind w:left="644"/>
+        <w:rPr>
+          <w:szCs w:val="26"/>
+        </w:rPr>
+      </w:pPr>
+      <w:r>
+        <w:rPr>
+          <w:szCs w:val="26"/>
+        </w:rPr>
+        <w:t xml:space="preserve">Đăng nhập và phân quyền </w:t>
+      </w:r>
+    </w:p>
+    <w:p>
+      <w:pPr>
+        <w:pStyle w:val="ListParagraph"/>
+        <w:ind w:left="644" w:firstLine="0"/>
+        <w:rPr>
+          <w:szCs w:val="26"/>
+        </w:rPr>
+      </w:pPr>
+      <w:r>
+        <w:rPr>
+          <w:szCs w:val="26"/>
+        </w:rPr>
+        <w:t>Hệ thống cho phép nhân viên đăng nhập bằng tài khoản được cấp để sử dụng các chức năng phù hợp với quyền hạn. Việc phân quyền giúp kiểm soát quyền truy cập và đảm bảo mỗi nhân viên chỉ thực hiện được các thao tác phù hợp với chức vụ được phân công.</w:t>
+      </w:r>
+    </w:p>
+    <w:p>
+      <w:pPr>
+        <w:pStyle w:val="ListParagraph"/>
+        <w:numPr>
+          <w:ilvl w:val="0"/>
+          <w:numId w:val="11"/>
+        </w:numPr>
+        <w:tabs>
+          <w:tab w:val="clear" w:pos="1350"/>
+          <w:tab w:val="num" w:pos="644"/>
+        </w:tabs>
+        <w:spacing w:before="0" w:after="160" w:line="278" w:lineRule="auto"/>
+        <w:ind w:left="644"/>
+        <w:rPr>
+          <w:szCs w:val="26"/>
+        </w:rPr>
+      </w:pPr>
+      <w:r>
+        <w:rPr>
+          <w:szCs w:val="26"/>
+        </w:rPr>
+        <w:t xml:space="preserve">Quản lý nhân viên </w:t>
+      </w:r>
+    </w:p>
+    <w:p>
+      <w:pPr>
+        <w:pStyle w:val="ListParagraph"/>
+        <w:ind w:left="644" w:firstLine="0"/>
+        <w:rPr>
+          <w:szCs w:val="26"/>
+        </w:rPr>
+      </w:pPr>
+      <w:r>
+        <w:rPr>
+          <w:szCs w:val="26"/>
+        </w:rPr>
+        <w:t>Hệ thống cho phép người dùng có quyền phù hợp thực hiện các thao tác thêm mới, cập nhật, tra cứu và quản lý thông tin nhân viên. Việc quản lý giúp cửa hàng theo dõi thông tin và tình trạng làm việc của nhân viên.</w:t>
+      </w:r>
+    </w:p>
+    <w:p>
+      <w:pPr>
+        <w:pStyle w:val="ListParagraph"/>
+        <w:numPr>
+          <w:ilvl w:val="0"/>
+          <w:numId w:val="12"/>
+        </w:numPr>
+        <w:tabs>
+          <w:tab w:val="clear" w:pos="1350"/>
+          <w:tab w:val="num" w:pos="644"/>
+        </w:tabs>
+        <w:spacing w:before="0" w:after="160" w:line="278" w:lineRule="auto"/>
+        <w:ind w:left="644"/>
+        <w:rPr>
+          <w:szCs w:val="26"/>
+        </w:rPr>
+      </w:pPr>
+      <w:r>
+        <w:rPr>
+          <w:szCs w:val="26"/>
+        </w:rPr>
+        <w:t xml:space="preserve">Quản lý khách hàng </w:t>
+      </w:r>
+    </w:p>
+    <w:p>
+      <w:pPr>
+        <w:pStyle w:val="ListParagraph"/>
+        <w:ind w:left="644" w:firstLine="0"/>
+        <w:rPr>
+          <w:szCs w:val="26"/>
+        </w:rPr>
+      </w:pPr>
+      <w:r>
+        <w:rPr>
+          <w:szCs w:val="26"/>
+        </w:rPr>
+        <w:lastRenderedPageBreak/>
+        <w:t>Hệ thống cho phép nhân viên thêm mới, cập nhật và tra cứu thông tin khách hàng. Thông tin khách hàng được sử dụng để quản lý các thú cưng thuộc sở hữu của khách hàng, lịch hẹn, dịch vụ chăm sóc và các giao dịch phát sinh.</w:t>
+      </w:r>
+    </w:p>
+    <w:p>
+      <w:pPr>
+        <w:pStyle w:val="ListParagraph"/>
+        <w:numPr>
+          <w:ilvl w:val="0"/>
+          <w:numId w:val="13"/>
+        </w:numPr>
+        <w:tabs>
+          <w:tab w:val="clear" w:pos="1350"/>
+          <w:tab w:val="num" w:pos="644"/>
+        </w:tabs>
+        <w:spacing w:before="0" w:after="160" w:line="278" w:lineRule="auto"/>
+        <w:ind w:left="644"/>
+        <w:rPr>
+          <w:szCs w:val="26"/>
+        </w:rPr>
+      </w:pPr>
+      <w:r>
+        <w:rPr>
+          <w:szCs w:val="26"/>
+        </w:rPr>
+        <w:t xml:space="preserve">Quản lý thú cưng </w:t>
+      </w:r>
+    </w:p>
+    <w:p>
+      <w:pPr>
+        <w:pStyle w:val="ListParagraph"/>
+        <w:ind w:left="644" w:firstLine="0"/>
+        <w:rPr>
+          <w:szCs w:val="26"/>
+        </w:rPr>
+      </w:pPr>
+      <w:r>
+        <w:rPr>
+          <w:szCs w:val="26"/>
+        </w:rPr>
+        <w:t>Hệ thống cho phép nhân viên thêm mới, cập nhật và tra cứu thông tin các thú cưng do khách hàng đưa đến cửa hàng để sử dụng dịch vụ chăm sóc. Mỗi thú cưng được liên kết với khách hàng sở hữu để phục vụ việc đặt lịch, tiếp nhận và theo dõi quá trình chăm sóc.</w:t>
+      </w:r>
+    </w:p>
+    <w:p>
+      <w:pPr>
+        <w:pStyle w:val="ListParagraph"/>
+        <w:numPr>
+          <w:ilvl w:val="0"/>
+          <w:numId w:val="14"/>
+        </w:numPr>
+        <w:tabs>
+          <w:tab w:val="clear" w:pos="1350"/>
+          <w:tab w:val="num" w:pos="644"/>
+        </w:tabs>
+        <w:spacing w:before="0" w:after="160" w:line="278" w:lineRule="auto"/>
+        <w:ind w:left="644"/>
+        <w:rPr>
+          <w:szCs w:val="26"/>
+        </w:rPr>
+      </w:pPr>
+      <w:r>
+        <w:rPr>
+          <w:szCs w:val="26"/>
+        </w:rPr>
+        <w:t xml:space="preserve">Quản lý sản phẩm </w:t>
+      </w:r>
+    </w:p>
+    <w:p>
+      <w:pPr>
+        <w:pStyle w:val="ListParagraph"/>
+        <w:ind w:left="644" w:firstLine="0"/>
+        <w:rPr>
+          <w:szCs w:val="26"/>
+        </w:rPr>
+      </w:pPr>
+      <w:r>
+        <w:rPr>
+          <w:szCs w:val="26"/>
+        </w:rPr>
+        <w:t>Hệ thống cho phép người dùng có quyền phù hợp thêm mới, cập nhật và tra cứu thông tin sản phẩm được kinh doanh tại cửa hàng. Chức năng này hỗ trợ quản lý các sản phẩm phục vụ hoạt động bán hàng và theo dõi tình trạng hàng hóa.</w:t>
+      </w:r>
+    </w:p>
+    <w:p>
+      <w:pPr>
+        <w:pStyle w:val="ListParagraph"/>
+        <w:numPr>
+          <w:ilvl w:val="0"/>
+          <w:numId w:val="14"/>
+        </w:numPr>
+        <w:tabs>
+          <w:tab w:val="clear" w:pos="1350"/>
+          <w:tab w:val="num" w:pos="644"/>
+        </w:tabs>
+        <w:spacing w:before="0" w:after="160" w:line="278" w:lineRule="auto"/>
+        <w:ind w:left="644"/>
+        <w:rPr>
+          <w:szCs w:val="26"/>
+        </w:rPr>
+      </w:pPr>
+      <w:r>
+        <w:rPr>
+          <w:szCs w:val="26"/>
+        </w:rPr>
+        <w:t xml:space="preserve">Quản lý tồn kho </w:t>
+      </w:r>
+    </w:p>
+    <w:p>
+      <w:pPr>
+        <w:pStyle w:val="ListParagraph"/>
+        <w:ind w:left="644" w:firstLine="0"/>
+        <w:rPr>
+          <w:szCs w:val="26"/>
+        </w:rPr>
+      </w:pPr>
+      <w:r>
+        <w:rPr>
+          <w:szCs w:val="26"/>
+        </w:rPr>
+        <w:t>Hệ thống cho phép theo dõi số lượng sản phẩm trong kho, quản lý quá trình nhập và xuất sản phẩm, đồng thời cập nhật số lượng tồn kho khi phát sinh giao dịch. Chức năng này giúp cửa hàng kiểm soát số lượng hàng hóa và hạn chế sai lệch tồn kho.</w:t>
+      </w:r>
+    </w:p>
+    <w:p>
+      <w:pPr>
+        <w:pStyle w:val="ListParagraph"/>
+        <w:numPr>
+          <w:ilvl w:val="0"/>
+          <w:numId w:val="15"/>
+        </w:numPr>
+        <w:tabs>
+          <w:tab w:val="clear" w:pos="1350"/>
+          <w:tab w:val="num" w:pos="644"/>
+        </w:tabs>
+        <w:spacing w:before="0" w:after="160" w:line="278" w:lineRule="auto"/>
+        <w:ind w:left="644"/>
+        <w:rPr>
+          <w:szCs w:val="26"/>
+        </w:rPr>
+      </w:pPr>
+      <w:r>
+        <w:rPr>
+          <w:szCs w:val="26"/>
+        </w:rPr>
+        <w:t xml:space="preserve">Quản lý dịch vụ chăm sóc </w:t>
+      </w:r>
+    </w:p>
+    <w:p>
+      <w:pPr>
+        <w:pStyle w:val="ListParagraph"/>
+        <w:ind w:left="644" w:firstLine="0"/>
+        <w:rPr>
+          <w:szCs w:val="26"/>
+        </w:rPr>
+      </w:pPr>
+      <w:r>
+        <w:rPr>
+          <w:szCs w:val="26"/>
+        </w:rPr>
+        <w:t>Hệ thống cho phép nhân viên có quyền phù hợp thêm mới, cập nhật và tra cứu các dịch vụ chăm sóc thú cưng. Các dịch vụ được sử dụng trong quá trình đặt lịch, thực hiện chăm sóc và lập hóa đơn cho khách hàng.</w:t>
+      </w:r>
+    </w:p>
+    <w:p>
+      <w:pPr>
+        <w:pStyle w:val="ListParagraph"/>
+        <w:numPr>
+          <w:ilvl w:val="0"/>
+          <w:numId w:val="15"/>
+        </w:numPr>
+        <w:tabs>
+          <w:tab w:val="clear" w:pos="1350"/>
+          <w:tab w:val="num" w:pos="644"/>
+        </w:tabs>
+        <w:spacing w:before="0" w:after="160" w:line="278" w:lineRule="auto"/>
+        <w:ind w:left="644"/>
+        <w:rPr>
+          <w:szCs w:val="26"/>
+        </w:rPr>
+      </w:pPr>
+      <w:r>
+        <w:rPr>
+          <w:szCs w:val="26"/>
+        </w:rPr>
+        <w:t xml:space="preserve">Quản lý lịch hẹn </w:t>
+      </w:r>
+    </w:p>
+    <w:p>
+      <w:pPr>
+        <w:pStyle w:val="ListParagraph"/>
+        <w:ind w:left="644" w:firstLine="0"/>
+        <w:rPr>
+          <w:szCs w:val="26"/>
+        </w:rPr>
+      </w:pPr>
+      <w:r>
+        <w:rPr>
+          <w:szCs w:val="26"/>
+        </w:rPr>
+        <w:t>Hệ thống cho phép nhân viên tạo mới, cập nhật, tra cứu và theo dõi các lịch hẹn chăm sóc thú cưng. Lịch hẹn được liên kết với khách hàng, thú cưng và dịch vụ tương ứng, đồng thời có thể cập nhật trạng thái trong quá trình phục vụ.</w:t>
+      </w:r>
+    </w:p>
+    <w:p>
+      <w:pPr>
+        <w:pStyle w:val="ListParagraph"/>
+        <w:numPr>
+          <w:ilvl w:val="0"/>
+          <w:numId w:val="16"/>
+        </w:numPr>
+        <w:tabs>
+          <w:tab w:val="clear" w:pos="1350"/>
+          <w:tab w:val="num" w:pos="644"/>
+        </w:tabs>
+        <w:spacing w:before="0" w:after="160" w:line="278" w:lineRule="auto"/>
+        <w:ind w:left="644"/>
+        <w:rPr>
+          <w:szCs w:val="26"/>
+        </w:rPr>
+      </w:pPr>
+      <w:r>
+        <w:rPr>
+          <w:szCs w:val="26"/>
+        </w:rPr>
+        <w:t xml:space="preserve">Bán hàng </w:t>
+      </w:r>
+    </w:p>
+    <w:p>
+      <w:pPr>
+        <w:pStyle w:val="ListParagraph"/>
+        <w:ind w:left="644" w:firstLine="0"/>
+        <w:rPr>
+          <w:szCs w:val="26"/>
+        </w:rPr>
+      </w:pPr>
+      <w:r>
+        <w:rPr>
+          <w:szCs w:val="26"/>
+        </w:rPr>
+        <w:t>Hệ thống hỗ trợ nhân viên thực hiện giao dịch bán sản phẩm và thanh toán các dịch vụ chăm sóc thú cưng. Khi giao dịch hoàn tất, hệ thống lập và lưu trữ hóa đơn, đồng thời cập nhật số lượng tồn kho đối với các sản phẩm đã bán.</w:t>
+      </w:r>
+    </w:p>
+    <w:p>
+      <w:pPr>
+        <w:pStyle w:val="ListParagraph"/>
+        <w:numPr>
+          <w:ilvl w:val="0"/>
+          <w:numId w:val="17"/>
+        </w:numPr>
+        <w:tabs>
+          <w:tab w:val="clear" w:pos="1350"/>
+          <w:tab w:val="num" w:pos="644"/>
+        </w:tabs>
+        <w:spacing w:before="0" w:after="160" w:line="278" w:lineRule="auto"/>
+        <w:ind w:left="644"/>
+        <w:rPr>
+          <w:szCs w:val="26"/>
+        </w:rPr>
+      </w:pPr>
+      <w:r>
+        <w:rPr>
+          <w:szCs w:val="26"/>
+        </w:rPr>
+        <w:t xml:space="preserve">Tìm kiếm và tra cứu </w:t>
+      </w:r>
+    </w:p>
+    <w:p>
+      <w:pPr>
+        <w:pStyle w:val="ListParagraph"/>
+        <w:ind w:left="644" w:firstLine="0"/>
+        <w:rPr>
+          <w:szCs w:val="26"/>
+        </w:rPr>
+      </w:pPr>
+      <w:r>
+        <w:rPr>
+          <w:szCs w:val="26"/>
+        </w:rPr>
+        <w:t xml:space="preserve">Hệ thống cung cấp chức năng tìm kiếm và tra cứu các thông tin đã được lưu trữ, bao gồm nhân viên, khách hàng, thú cưng, sản phẩm, dịch vụ, tồn kho, </w:t>
+      </w:r>
+      <w:r>
+        <w:rPr>
+          <w:szCs w:val="26"/>
+        </w:rPr>
+        <w:lastRenderedPageBreak/>
+        <w:t>lịch hẹn và hóa đơn. Chức năng này giúp người dùng nhanh chóng tìm kiếm thông tin phục vụ các nghiệp vụ quản lý và chăm sóc khách hàng.</w:t>
+      </w:r>
+    </w:p>
+    <w:p>
+      <w:pPr>
+        <w:pStyle w:val="ListParagraph"/>
+        <w:numPr>
+          <w:ilvl w:val="0"/>
+          <w:numId w:val="18"/>
+        </w:numPr>
+        <w:tabs>
+          <w:tab w:val="clear" w:pos="1350"/>
+          <w:tab w:val="num" w:pos="644"/>
+        </w:tabs>
+        <w:spacing w:before="0" w:after="160" w:line="278" w:lineRule="auto"/>
+        <w:ind w:left="644"/>
+        <w:rPr>
+          <w:szCs w:val="26"/>
+        </w:rPr>
+      </w:pPr>
+      <w:r>
+        <w:rPr>
+          <w:szCs w:val="26"/>
+        </w:rPr>
+        <w:t xml:space="preserve">Báo cáo và thống kê </w:t>
+      </w:r>
+    </w:p>
+    <w:p>
+      <w:pPr>
+        <w:pStyle w:val="ListParagraph"/>
+        <w:ind w:left="644" w:firstLine="0"/>
+        <w:rPr>
+          <w:szCs w:val="26"/>
+        </w:rPr>
+      </w:pPr>
+      <w:r>
+        <w:rPr>
+          <w:szCs w:val="26"/>
+        </w:rPr>
+        <w:t>Hệ thống tổng hợp dữ liệu đã lưu trữ để hỗ trợ quản lý và đánh giá hoạt động của cửa hàng. Các nội dung có thể thống kê gồm số lượng khách hàng, thú cưng, sản phẩm, dịch vụ, tình hình tồn kho, số lượng lịch hẹn, số lượng hóa đơn và doanh thu từ bán sản phẩm và cung cấp dịch vụ theo khoảng thời gian.</w:t>
+      </w:r>
+    </w:p>
+    <w:p/>
+    <w:p>
+      <w:pPr>
         <w:pStyle w:val="Heading2"/>
       </w:pPr>
       <w:r>
@@ -7030,6 +7502,7 @@
       </w:r>
       <w:bookmarkEnd w:id="19"/>
     </w:p>
+    <w:p/>
     <w:p>
       <w:pPr>
         <w:spacing w:before="0" w:line="240" w:lineRule="auto"/>
@@ -8010,7 +8483,15 @@
         <w:ind w:left="0"/>
       </w:pPr>
       <w:r>
-        <w:t>&lt;Phần này mô tả một cách chi tiết từng yêu cầu cụ thể, cho phép các thành viên tham gia dự án căn cứ vào đó để xây dựng một phần mềm có chất lượng tốt nhất. Với cách tiếp cận theo mô hình UseCase (UC), các yêu cầu phần mềm  được mô tả theo các UC và trong các đặc tả bổ sung&gt;.</w:t>
+        <w:t xml:space="preserve">&lt;Phần này mô tả một cách chi tiết từng yêu cầu cụ thể, cho phép các thành viên tham gia dự án căn cứ vào đó để xây dựng một phần mềm có chất lượng tốt nhất. Với cách tiếp cận theo mô hình UseCase (UC), các yêu cầu phần </w:t>
+      </w:r>
+      <w:proofErr w:type="gramStart"/>
+      <w:r>
+        <w:t>mềm  được</w:t>
+      </w:r>
+      <w:proofErr w:type="gramEnd"/>
+      <w:r>
+        <w:t xml:space="preserve"> mô tả theo các UC và trong các đặc tả bổ sung&gt;.</w:t>
       </w:r>
     </w:p>
     <w:p>
@@ -8348,7 +8829,25 @@
                 <w:sz w:val="26"/>
                 <w:szCs w:val="26"/>
               </w:rPr>
-              <w:t>&lt;Kết quả thu được sau khi thực hiện đúng &amp;  kết thúc UseCase&gt;.</w:t>
+              <w:t xml:space="preserve">&lt;Kết quả thu được sau khi thực hiện đúng </w:t>
+            </w:r>
+            <w:proofErr w:type="gramStart"/>
+            <w:r>
+              <w:rPr>
+                <w:rFonts w:ascii="Times New Roman" w:hAnsi="Times New Roman"/>
+                <w:sz w:val="26"/>
+                <w:szCs w:val="26"/>
+              </w:rPr>
+              <w:t>&amp;  kết</w:t>
+            </w:r>
+            <w:proofErr w:type="gramEnd"/>
+            <w:r>
+              <w:rPr>
+                <w:rFonts w:ascii="Times New Roman" w:hAnsi="Times New Roman"/>
+                <w:sz w:val="26"/>
+                <w:szCs w:val="26"/>
+              </w:rPr>
+              <w:t xml:space="preserve"> thúc UseCase&gt;.</w:t>
             </w:r>
           </w:p>
         </w:tc>
@@ -8949,7 +9448,25 @@
                 <w:sz w:val="26"/>
                 <w:szCs w:val="26"/>
               </w:rPr>
-              <w:t>&lt;Kết quả thu được sau khi thực hiện đúng &amp;  kết thúc UseCase&gt;.</w:t>
+              <w:t xml:space="preserve">&lt;Kết quả thu được sau khi thực hiện đúng </w:t>
+            </w:r>
+            <w:proofErr w:type="gramStart"/>
+            <w:r>
+              <w:rPr>
+                <w:rFonts w:ascii="Times New Roman" w:hAnsi="Times New Roman"/>
+                <w:sz w:val="26"/>
+                <w:szCs w:val="26"/>
+              </w:rPr>
+              <w:t>&amp;  kết</w:t>
+            </w:r>
+            <w:proofErr w:type="gramEnd"/>
+            <w:r>
+              <w:rPr>
+                <w:rFonts w:ascii="Times New Roman" w:hAnsi="Times New Roman"/>
+                <w:sz w:val="26"/>
+                <w:szCs w:val="26"/>
+              </w:rPr>
+              <w:t xml:space="preserve"> thúc UseCase&gt;.</w:t>
             </w:r>
           </w:p>
         </w:tc>
@@ -9482,7 +9999,25 @@
                 <w:sz w:val="26"/>
                 <w:szCs w:val="26"/>
               </w:rPr>
-              <w:t>&lt;Kết quả thu được sau khi thực hiện đúng &amp;  kết thúc UseCase&gt;.</w:t>
+              <w:t xml:space="preserve">&lt;Kết quả thu được sau khi thực hiện đúng </w:t>
+            </w:r>
+            <w:proofErr w:type="gramStart"/>
+            <w:r>
+              <w:rPr>
+                <w:rFonts w:ascii="Times New Roman" w:hAnsi="Times New Roman"/>
+                <w:sz w:val="26"/>
+                <w:szCs w:val="26"/>
+              </w:rPr>
+              <w:t>&amp;  kết</w:t>
+            </w:r>
+            <w:proofErr w:type="gramEnd"/>
+            <w:r>
+              <w:rPr>
+                <w:rFonts w:ascii="Times New Roman" w:hAnsi="Times New Roman"/>
+                <w:sz w:val="26"/>
+                <w:szCs w:val="26"/>
+              </w:rPr>
+              <w:t xml:space="preserve"> thúc UseCase&gt;.</w:t>
             </w:r>
           </w:p>
         </w:tc>
@@ -11250,11 +11785,19 @@
                 <w:sz w:val="24"/>
               </w:rPr>
             </w:pPr>
-            <w:r>
-              <w:rPr>
-                <w:sz w:val="24"/>
-              </w:rPr>
-              <w:t>setMaNV(string manv)</w:t>
+            <w:proofErr w:type="gramStart"/>
+            <w:r>
+              <w:rPr>
+                <w:sz w:val="24"/>
+              </w:rPr>
+              <w:t>setMaNV(</w:t>
+            </w:r>
+            <w:proofErr w:type="gramEnd"/>
+            <w:r>
+              <w:rPr>
+                <w:sz w:val="24"/>
+              </w:rPr>
+              <w:t>string manv)</w:t>
             </w:r>
           </w:p>
         </w:tc>
@@ -11302,8 +11845,16 @@
               <w:rPr>
                 <w:sz w:val="24"/>
               </w:rPr>
-              <w:t>Phát sinh day số theo quy luật…..</w:t>
-            </w:r>
+              <w:t>Phát sinh day số theo quy luật</w:t>
+            </w:r>
+            <w:proofErr w:type="gramStart"/>
+            <w:r>
+              <w:rPr>
+                <w:sz w:val="24"/>
+              </w:rPr>
+              <w:t>…..</w:t>
+            </w:r>
+            <w:proofErr w:type="gramEnd"/>
           </w:p>
         </w:tc>
         <w:tc>
@@ -11371,11 +11922,19 @@
                 <w:sz w:val="24"/>
               </w:rPr>
             </w:pPr>
-            <w:r>
-              <w:rPr>
-                <w:sz w:val="24"/>
-              </w:rPr>
-              <w:t>setHoTen(string hoten)</w:t>
+            <w:proofErr w:type="gramStart"/>
+            <w:r>
+              <w:rPr>
+                <w:sz w:val="24"/>
+              </w:rPr>
+              <w:t>setHoTen(</w:t>
+            </w:r>
+            <w:proofErr w:type="gramEnd"/>
+            <w:r>
+              <w:rPr>
+                <w:sz w:val="24"/>
+              </w:rPr>
+              <w:t>string hoten)</w:t>
             </w:r>
           </w:p>
         </w:tc>
@@ -11493,11 +12052,19 @@
                 <w:sz w:val="24"/>
               </w:rPr>
             </w:pPr>
-            <w:r>
-              <w:rPr>
-                <w:sz w:val="24"/>
-              </w:rPr>
-              <w:t>setNgaySinh(datetime ngaysinh)</w:t>
+            <w:proofErr w:type="gramStart"/>
+            <w:r>
+              <w:rPr>
+                <w:sz w:val="24"/>
+              </w:rPr>
+              <w:t>setNgaySinh(</w:t>
+            </w:r>
+            <w:proofErr w:type="gramEnd"/>
+            <w:r>
+              <w:rPr>
+                <w:sz w:val="24"/>
+              </w:rPr>
+              <w:t>datetime ngaysinh)</w:t>
             </w:r>
           </w:p>
         </w:tc>
@@ -11615,11 +12182,19 @@
                 <w:sz w:val="24"/>
               </w:rPr>
             </w:pPr>
-            <w:r>
-              <w:rPr>
-                <w:sz w:val="24"/>
-              </w:rPr>
-              <w:t>setDiaChi(string diachi)</w:t>
+            <w:proofErr w:type="gramStart"/>
+            <w:r>
+              <w:rPr>
+                <w:sz w:val="24"/>
+              </w:rPr>
+              <w:t>setDiaChi(</w:t>
+            </w:r>
+            <w:proofErr w:type="gramEnd"/>
+            <w:r>
+              <w:rPr>
+                <w:sz w:val="24"/>
+              </w:rPr>
+              <w:t>string diachi)</w:t>
             </w:r>
           </w:p>
         </w:tc>
@@ -11725,11 +12300,19 @@
                 <w:sz w:val="24"/>
               </w:rPr>
             </w:pPr>
-            <w:r>
-              <w:rPr>
-                <w:sz w:val="24"/>
-              </w:rPr>
-              <w:t>setNgayVaoLam(datetime ngayvaolam)</w:t>
+            <w:proofErr w:type="gramStart"/>
+            <w:r>
+              <w:rPr>
+                <w:sz w:val="24"/>
+              </w:rPr>
+              <w:t>setNgayVaoLam(</w:t>
+            </w:r>
+            <w:proofErr w:type="gramEnd"/>
+            <w:r>
+              <w:rPr>
+                <w:sz w:val="24"/>
+              </w:rPr>
+              <w:t>datetime ngayvaolam)</w:t>
             </w:r>
           </w:p>
         </w:tc>
@@ -11841,11 +12424,19 @@
                 <w:sz w:val="24"/>
               </w:rPr>
             </w:pPr>
-            <w:r>
-              <w:rPr>
-                <w:sz w:val="24"/>
-              </w:rPr>
-              <w:t>setTrinhDo(string trinhdo)</w:t>
+            <w:proofErr w:type="gramStart"/>
+            <w:r>
+              <w:rPr>
+                <w:sz w:val="24"/>
+              </w:rPr>
+              <w:t>setTrinhDo(</w:t>
+            </w:r>
+            <w:proofErr w:type="gramEnd"/>
+            <w:r>
+              <w:rPr>
+                <w:sz w:val="24"/>
+              </w:rPr>
+              <w:t>string trinhdo)</w:t>
             </w:r>
           </w:p>
         </w:tc>
@@ -11951,11 +12542,19 @@
                 <w:sz w:val="24"/>
               </w:rPr>
             </w:pPr>
-            <w:r>
-              <w:rPr>
-                <w:sz w:val="24"/>
-              </w:rPr>
-              <w:t>setHeSoLuong(float hesoluong)</w:t>
+            <w:proofErr w:type="gramStart"/>
+            <w:r>
+              <w:rPr>
+                <w:sz w:val="24"/>
+              </w:rPr>
+              <w:t>setHeSoLuong(</w:t>
+            </w:r>
+            <w:proofErr w:type="gramEnd"/>
+            <w:r>
+              <w:rPr>
+                <w:sz w:val="24"/>
+              </w:rPr>
+              <w:t>float hesoluong)</w:t>
             </w:r>
           </w:p>
         </w:tc>
@@ -12073,11 +12672,19 @@
                 <w:sz w:val="24"/>
               </w:rPr>
             </w:pPr>
-            <w:r>
-              <w:rPr>
-                <w:sz w:val="24"/>
-              </w:rPr>
-              <w:t>setLuongCanBan(int luongcanban)</w:t>
+            <w:proofErr w:type="gramStart"/>
+            <w:r>
+              <w:rPr>
+                <w:sz w:val="24"/>
+              </w:rPr>
+              <w:t>setLuongCanBan(</w:t>
+            </w:r>
+            <w:proofErr w:type="gramEnd"/>
+            <w:r>
+              <w:rPr>
+                <w:sz w:val="24"/>
+              </w:rPr>
+              <w:t>int luongcanban)</w:t>
             </w:r>
           </w:p>
         </w:tc>
@@ -12152,7 +12759,21 @@
               <w:rPr>
                 <w:sz w:val="24"/>
               </w:rPr>
-              <w:t>Throw exception “Lương căn bản &gt;0  ” nếu tham số hesoluong không hợp lệ</w:t>
+              <w:t>Throw exception “Lương căn bản &gt;</w:t>
+            </w:r>
+            <w:proofErr w:type="gramStart"/>
+            <w:r>
+              <w:rPr>
+                <w:sz w:val="24"/>
+              </w:rPr>
+              <w:t>0  ”</w:t>
+            </w:r>
+            <w:proofErr w:type="gramEnd"/>
+            <w:r>
+              <w:rPr>
+                <w:sz w:val="24"/>
+              </w:rPr>
+              <w:t xml:space="preserve"> nếu tham số hesoluong không hợp lệ</w:t>
             </w:r>
           </w:p>
         </w:tc>
@@ -12363,7 +12984,23 @@
                 <w:b/>
                 <w:sz w:val="24"/>
               </w:rPr>
-              <w:t>Viết phương thức toString()</w:t>
+              <w:t xml:space="preserve">Viết phương thức </w:t>
+            </w:r>
+            <w:proofErr w:type="gramStart"/>
+            <w:r>
+              <w:rPr>
+                <w:b/>
+                <w:sz w:val="24"/>
+              </w:rPr>
+              <w:t>toString(</w:t>
+            </w:r>
+            <w:proofErr w:type="gramEnd"/>
+            <w:r>
+              <w:rPr>
+                <w:b/>
+                <w:sz w:val="24"/>
+              </w:rPr>
+              <w:t>)</w:t>
             </w:r>
           </w:p>
         </w:tc>
@@ -12530,7 +13167,7 @@
           <w:noProof/>
         </w:rPr>
         <w:drawing>
-          <wp:inline distT="0" distB="0" distL="0" distR="0" wp14:anchorId="7BB8721A" wp14:editId="4E79BF03">
+          <wp:inline distT="0" distB="0" distL="0" distR="0" wp14:anchorId="7BB8721A" wp14:editId="0471B829">
             <wp:extent cx="1639614" cy="589327"/>
             <wp:effectExtent l="0" t="0" r="0" b="0"/>
             <wp:docPr id="972141918" name="Picture 1"/>
@@ -12761,7 +13398,7 @@
           </mc:Choice>
           <mc:Fallback>
             <w:pict>
-              <v:rect w14:anchorId="0AB64CB1" id="Rectangle 10" o:spid="_x0000_s1026" style="position:absolute;margin-left:9.95pt;margin-top:157.05pt;width:47.5pt;height:19pt;z-index:251666432;visibility:visible;mso-wrap-style:square;mso-height-percent:0;mso-wrap-distance-left:9pt;mso-wrap-distance-top:0;mso-wrap-distance-right:9pt;mso-wrap-distance-bottom:0;mso-position-horizontal:absolute;mso-position-horizontal-relative:text;mso-position-vertical:absolute;mso-position-vertical-relative:text;mso-height-percent:0;mso-height-relative:margin;v-text-anchor:middle" o:gfxdata="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" fillcolor="#fabf8f [1945]" strokecolor="#243f60 [1604]" strokeweight="2pt"/>
+              <v:rect w14:anchorId="7DBDFBEC" id="Rectangle 10" o:spid="_x0000_s1026" style="position:absolute;margin-left:9.95pt;margin-top:157.05pt;width:47.5pt;height:19pt;z-index:251666432;visibility:visible;mso-wrap-style:square;mso-height-percent:0;mso-wrap-distance-left:9pt;mso-wrap-distance-top:0;mso-wrap-distance-right:9pt;mso-wrap-distance-bottom:0;mso-position-horizontal:absolute;mso-position-horizontal-relative:text;mso-position-vertical:absolute;mso-position-vertical-relative:text;mso-height-percent:0;mso-height-relative:margin;v-text-anchor:middle" o:gfxdata="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" fillcolor="#fabf8f [1945]" strokecolor="#243f60 [1604]" strokeweight="2pt"/>
             </w:pict>
           </mc:Fallback>
         </mc:AlternateContent>
@@ -12835,7 +13472,7 @@
           </mc:Choice>
           <mc:Fallback>
             <w:pict>
-              <v:rect w14:anchorId="39A83528" id="Rectangle 11" o:spid="_x0000_s1026" style="position:absolute;margin-left:10.25pt;margin-top:180.3pt;width:47.5pt;height:19pt;z-index:251667456;visibility:visible;mso-wrap-style:square;mso-height-percent:0;mso-wrap-distance-left:9pt;mso-wrap-distance-top:0;mso-wrap-distance-right:9pt;mso-wrap-distance-bottom:0;mso-position-horizontal:absolute;mso-position-horizontal-relative:text;mso-position-vertical:absolute;mso-position-vertical-relative:text;mso-height-percent:0;mso-height-relative:margin;v-text-anchor:middle" o:gfxdata="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" fillcolor="#c00000" strokecolor="#243f60 [1604]" strokeweight="2pt"/>
+              <v:rect w14:anchorId="3961EE6C" id="Rectangle 11" o:spid="_x0000_s1026" style="position:absolute;margin-left:10.25pt;margin-top:180.3pt;width:47.5pt;height:19pt;z-index:251667456;visibility:visible;mso-wrap-style:square;mso-height-percent:0;mso-wrap-distance-left:9pt;mso-wrap-distance-top:0;mso-wrap-distance-right:9pt;mso-wrap-distance-bottom:0;mso-position-horizontal:absolute;mso-position-horizontal-relative:text;mso-position-vertical:absolute;mso-position-vertical-relative:text;mso-height-percent:0;mso-height-relative:margin;v-text-anchor:middle" o:gfxdata="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" fillcolor="#c00000" strokecolor="#243f60 [1604]" strokeweight="2pt"/>
             </w:pict>
           </mc:Fallback>
         </mc:AlternateContent>
@@ -12911,7 +13548,7 @@
           </mc:Choice>
           <mc:Fallback>
             <w:pict>
-              <v:rect w14:anchorId="22146738" id="Rectangle 13" o:spid="_x0000_s1026" style="position:absolute;margin-left:10.3pt;margin-top:130.8pt;width:47.55pt;height:19pt;z-index:251668480;visibility:visible;mso-wrap-style:square;mso-height-percent:0;mso-wrap-distance-left:9pt;mso-wrap-distance-top:0;mso-wrap-distance-right:9pt;mso-wrap-distance-bottom:0;mso-position-horizontal:absolute;mso-position-horizontal-relative:text;mso-position-vertical:absolute;mso-position-vertical-relative:text;mso-height-percent:0;mso-height-relative:margin;v-text-anchor:middle" o:gfxdata="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" fillcolor="#365f91 [2404]" strokecolor="#243f60 [1604]" strokeweight="2pt"/>
+              <v:rect w14:anchorId="62C317D7" id="Rectangle 13" o:spid="_x0000_s1026" style="position:absolute;margin-left:10.3pt;margin-top:130.8pt;width:47.55pt;height:19pt;z-index:251668480;visibility:visible;mso-wrap-style:square;mso-height-percent:0;mso-wrap-distance-left:9pt;mso-wrap-distance-top:0;mso-wrap-distance-right:9pt;mso-wrap-distance-bottom:0;mso-position-horizontal:absolute;mso-position-horizontal-relative:text;mso-position-vertical:absolute;mso-position-vertical-relative:text;mso-height-percent:0;mso-height-relative:margin;v-text-anchor:middle" o:gfxdata="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" fillcolor="#365f91 [2404]" strokecolor="#243f60 [1604]" strokeweight="2pt"/>
             </w:pict>
           </mc:Fallback>
         </mc:AlternateContent>
@@ -13161,7 +13798,7 @@
           </mc:Choice>
           <mc:Fallback>
             <w:pict>
-              <v:rect w14:anchorId="0ACB0CA2" id="Rectangle 14" o:spid="_x0000_s1026" style="position:absolute;margin-left:127.45pt;margin-top:90.65pt;width:189.9pt;height:73.9pt;z-index:251664384;visibility:visible;mso-wrap-style:square;mso-wrap-distance-left:9pt;mso-wrap-distance-top:0;mso-wrap-distance-right:9pt;mso-wrap-distance-bottom:0;mso-position-horizontal:absolute;mso-position-horizontal-relative:text;mso-position-vertical:absolute;mso-position-vertical-relative:text;v-text-anchor:middle" o:gfxdata="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" filled="f" strokecolor="#f79646 [3209]" strokeweight="3pt"/>
+              <v:rect w14:anchorId="061118FC" id="Rectangle 14" o:spid="_x0000_s1026" style="position:absolute;margin-left:127.45pt;margin-top:90.65pt;width:189.9pt;height:73.9pt;z-index:251664384;visibility:visible;mso-wrap-style:square;mso-wrap-distance-left:9pt;mso-wrap-distance-top:0;mso-wrap-distance-right:9pt;mso-wrap-distance-bottom:0;mso-position-horizontal:absolute;mso-position-horizontal-relative:text;mso-position-vertical:absolute;mso-position-vertical-relative:text;v-text-anchor:middle" o:gfxdata="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" filled="f" strokecolor="#f79646 [3209]" strokeweight="3pt"/>
             </w:pict>
           </mc:Fallback>
         </mc:AlternateContent>
@@ -13703,7 +14340,7 @@
           </mc:Choice>
           <mc:Fallback>
             <w:pict>
-              <v:shapetype w14:anchorId="56B0BCF0" id="_x0000_t88" coordsize="21600,21600" o:spt="88" adj="1800,10800" path="m,qx10800@0l10800@2qy21600@11,10800@3l10800@1qy,21600e" filled="f">
+              <v:shapetype w14:anchorId="5053AC7E" id="_x0000_t88" coordsize="21600,21600" o:spt="88" adj="1800,10800" path="m,qx10800@0l10800@2qy21600@11,10800@3l10800@1qy,21600e" filled="f">
                 <v:formulas>
                   <v:f eqn="val #0"/>
                   <v:f eqn="sum 21600 0 #0"/>
@@ -13915,8 +14552,17 @@
           <w:sz w:val="22"/>
           <w:szCs w:val="22"/>
         </w:rPr>
-        <w:t>: màn hình …………..</w:t>
-      </w:r>
+        <w:t>: màn hình ………</w:t>
+      </w:r>
+      <w:proofErr w:type="gramStart"/>
+      <w:r>
+        <w:rPr>
+          <w:sz w:val="22"/>
+          <w:szCs w:val="22"/>
+        </w:rPr>
+        <w:t>…..</w:t>
+      </w:r>
+      <w:proofErr w:type="gramEnd"/>
     </w:p>
     <w:p>
       <w:pPr>
@@ -14349,7 +14995,29 @@
           <w:sz w:val="28"/>
           <w:szCs w:val="28"/>
         </w:rPr>
-        <w:t>Em là sinh viên khoa CNTT, nhận thấy yêu cầu về ứng dụng CNTT trong xã hội rất lớn và em (hoặc kết hợp với nhóm bạn) thành lập công ty để  phát triển dự án khởi nghiệp</w:t>
+        <w:t xml:space="preserve">Em là sinh viên khoa CNTT, nhận thấy yêu cầu về ứng dụng CNTT trong xã hội rất lớn và em (hoặc kết hợp với nhóm bạn) thành lập công ty </w:t>
+      </w:r>
+      <w:proofErr w:type="gramStart"/>
+      <w:r>
+        <w:rPr>
+          <w:i/>
+          <w:iCs/>
+          <w:color w:val="548DD4" w:themeColor="text2" w:themeTint="99"/>
+          <w:sz w:val="28"/>
+          <w:szCs w:val="28"/>
+        </w:rPr>
+        <w:t>để  phát</w:t>
+      </w:r>
+      <w:proofErr w:type="gramEnd"/>
+      <w:r>
+        <w:rPr>
+          <w:i/>
+          <w:iCs/>
+          <w:color w:val="548DD4" w:themeColor="text2" w:themeTint="99"/>
+          <w:sz w:val="28"/>
+          <w:szCs w:val="28"/>
+        </w:rPr>
+        <w:t xml:space="preserve"> triển dự án khởi nghiệp</w:t>
       </w:r>
       <w:r>
         <w:rPr>
@@ -14562,8 +15230,13 @@
     </w:p>
     <w:p>
       <w:r>
-        <w:t>- Tài liệu không có tên tác giả: xếp thứ tự theo bảng chữ cái đối với từ đầu tiên của tên cơ quan đã ấn hành tài liệu, ví dụ: Viện Khoa học Việt nam xếp vào vần V, Trung tâm Chọn Giống Lúa vần T,..</w:t>
-      </w:r>
+        <w:t xml:space="preserve">- Tài liệu không có tên tác giả: xếp thứ tự theo bảng chữ cái đối với từ đầu tiên của tên cơ quan đã ấn hành tài liệu, ví dụ: Viện Khoa học Việt nam xếp vào vần V, Trung tâm Chọn Giống Lúa vần </w:t>
+      </w:r>
+      <w:proofErr w:type="gramStart"/>
+      <w:r>
+        <w:t>T,..</w:t>
+      </w:r>
+      <w:proofErr w:type="gramEnd"/>
     </w:p>
     <w:p>
       <w:r>
@@ -14572,7 +15245,15 @@
     </w:p>
     <w:p>
       <w:r>
-        <w:t>- tên các tác giả (có dấu phẩy ngăn cách giữa các tên tác giả)</w:t>
+        <w:t xml:space="preserve">- </w:t>
+      </w:r>
+      <w:proofErr w:type="gramStart"/>
+      <w:r>
+        <w:t>tên các tác giả (có dấu phẩy ngăn cách giữa các tên tác giả</w:t>
+      </w:r>
+      <w:proofErr w:type="gramEnd"/>
+      <w:r>
+        <w:t>)</w:t>
       </w:r>
     </w:p>
     <w:p>
@@ -14695,7 +15376,7 @@
           <w:noProof/>
         </w:rPr>
         <w:drawing>
-          <wp:inline distT="0" distB="0" distL="0" distR="0" wp14:anchorId="5CE39CCD" wp14:editId="0E6B892A">
+          <wp:inline distT="0" distB="0" distL="0" distR="0" wp14:anchorId="5CE39CCD" wp14:editId="09EA815E">
             <wp:extent cx="5580380" cy="3687445"/>
             <wp:effectExtent l="0" t="0" r="0" b="0"/>
             <wp:docPr id="2" name="Picture 2" descr="A close-up of a document&#10;&#10;Description automatically generated"/>
@@ -15222,9 +15903,9 @@
     </w:lvl>
   </w:abstractNum>
   <w:abstractNum w:abstractNumId="1" w15:restartNumberingAfterBreak="0">
-    <w:nsid w:val="1D667D23"/>
+    <w:nsid w:val="048C2B71"/>
     <w:multiLevelType w:val="multilevel"/>
-    <w:tmpl w:val="2E0E5654"/>
+    <w:tmpl w:val="1C22AD24"/>
     <w:lvl w:ilvl="0">
       <w:start w:val="1"/>
       <w:numFmt w:val="bullet"/>
@@ -15371,6 +16052,900 @@
     </w:lvl>
   </w:abstractNum>
   <w:abstractNum w:abstractNumId="2" w15:restartNumberingAfterBreak="0">
+    <w:nsid w:val="154A647B"/>
+    <w:multiLevelType w:val="multilevel"/>
+    <w:tmpl w:val="B212E62E"/>
+    <w:lvl w:ilvl="0">
+      <w:start w:val="1"/>
+      <w:numFmt w:val="bullet"/>
+      <w:lvlText w:val="-"/>
+      <w:lvlJc w:val="left"/>
+      <w:pPr>
+        <w:tabs>
+          <w:tab w:val="num" w:pos="1350"/>
+        </w:tabs>
+        <w:ind w:left="1350" w:hanging="360"/>
+      </w:pPr>
+      <w:rPr>
+        <w:rFonts w:ascii="Times New Roman" w:eastAsia="Times New Roman" w:hAnsi="Times New Roman" w:cs="Times New Roman" w:hint="default"/>
+        <w:sz w:val="20"/>
+      </w:rPr>
+    </w:lvl>
+    <w:lvl w:ilvl="1" w:tentative="1">
+      <w:start w:val="1"/>
+      <w:numFmt w:val="bullet"/>
+      <w:lvlText w:val="o"/>
+      <w:lvlJc w:val="left"/>
+      <w:pPr>
+        <w:tabs>
+          <w:tab w:val="num" w:pos="2070"/>
+        </w:tabs>
+        <w:ind w:left="2070" w:hanging="360"/>
+      </w:pPr>
+      <w:rPr>
+        <w:rFonts w:ascii="Courier New" w:hAnsi="Courier New" w:hint="default"/>
+        <w:sz w:val="20"/>
+      </w:rPr>
+    </w:lvl>
+    <w:lvl w:ilvl="2" w:tentative="1">
+      <w:start w:val="1"/>
+      <w:numFmt w:val="bullet"/>
+      <w:lvlText w:val=""/>
+      <w:lvlJc w:val="left"/>
+      <w:pPr>
+        <w:tabs>
+          <w:tab w:val="num" w:pos="2790"/>
+        </w:tabs>
+        <w:ind w:left="2790" w:hanging="360"/>
+      </w:pPr>
+      <w:rPr>
+        <w:rFonts w:ascii="Wingdings" w:hAnsi="Wingdings" w:hint="default"/>
+        <w:sz w:val="20"/>
+      </w:rPr>
+    </w:lvl>
+    <w:lvl w:ilvl="3" w:tentative="1">
+      <w:start w:val="1"/>
+      <w:numFmt w:val="bullet"/>
+      <w:lvlText w:val=""/>
+      <w:lvlJc w:val="left"/>
+      <w:pPr>
+        <w:tabs>
+          <w:tab w:val="num" w:pos="3510"/>
+        </w:tabs>
+        <w:ind w:left="3510" w:hanging="360"/>
+      </w:pPr>
+      <w:rPr>
+        <w:rFonts w:ascii="Wingdings" w:hAnsi="Wingdings" w:hint="default"/>
+        <w:sz w:val="20"/>
+      </w:rPr>
+    </w:lvl>
+    <w:lvl w:ilvl="4" w:tentative="1">
+      <w:start w:val="1"/>
+      <w:numFmt w:val="bullet"/>
+      <w:lvlText w:val=""/>
+      <w:lvlJc w:val="left"/>
+      <w:pPr>
+        <w:tabs>
+          <w:tab w:val="num" w:pos="4230"/>
+        </w:tabs>
+        <w:ind w:left="4230" w:hanging="360"/>
+      </w:pPr>
+      <w:rPr>
+        <w:rFonts w:ascii="Wingdings" w:hAnsi="Wingdings" w:hint="default"/>
+        <w:sz w:val="20"/>
+      </w:rPr>
+    </w:lvl>
+    <w:lvl w:ilvl="5" w:tentative="1">
+      <w:start w:val="1"/>
+      <w:numFmt w:val="bullet"/>
+      <w:lvlText w:val=""/>
+      <w:lvlJc w:val="left"/>
+      <w:pPr>
+        <w:tabs>
+          <w:tab w:val="num" w:pos="4950"/>
+        </w:tabs>
+        <w:ind w:left="4950" w:hanging="360"/>
+      </w:pPr>
+      <w:rPr>
+        <w:rFonts w:ascii="Wingdings" w:hAnsi="Wingdings" w:hint="default"/>
+        <w:sz w:val="20"/>
+      </w:rPr>
+    </w:lvl>
+    <w:lvl w:ilvl="6" w:tentative="1">
+      <w:start w:val="1"/>
+      <w:numFmt w:val="bullet"/>
+      <w:lvlText w:val=""/>
+      <w:lvlJc w:val="left"/>
+      <w:pPr>
+        <w:tabs>
+          <w:tab w:val="num" w:pos="5670"/>
+        </w:tabs>
+        <w:ind w:left="5670" w:hanging="360"/>
+      </w:pPr>
+      <w:rPr>
+        <w:rFonts w:ascii="Wingdings" w:hAnsi="Wingdings" w:hint="default"/>
+        <w:sz w:val="20"/>
+      </w:rPr>
+    </w:lvl>
+    <w:lvl w:ilvl="7" w:tentative="1">
+      <w:start w:val="1"/>
+      <w:numFmt w:val="bullet"/>
+      <w:lvlText w:val=""/>
+      <w:lvlJc w:val="left"/>
+      <w:pPr>
+        <w:tabs>
+          <w:tab w:val="num" w:pos="6390"/>
+        </w:tabs>
+        <w:ind w:left="6390" w:hanging="360"/>
+      </w:pPr>
+      <w:rPr>
+        <w:rFonts w:ascii="Wingdings" w:hAnsi="Wingdings" w:hint="default"/>
+        <w:sz w:val="20"/>
+      </w:rPr>
+    </w:lvl>
+    <w:lvl w:ilvl="8" w:tentative="1">
+      <w:start w:val="1"/>
+      <w:numFmt w:val="bullet"/>
+      <w:lvlText w:val=""/>
+      <w:lvlJc w:val="left"/>
+      <w:pPr>
+        <w:tabs>
+          <w:tab w:val="num" w:pos="7110"/>
+        </w:tabs>
+        <w:ind w:left="7110" w:hanging="360"/>
+      </w:pPr>
+      <w:rPr>
+        <w:rFonts w:ascii="Wingdings" w:hAnsi="Wingdings" w:hint="default"/>
+        <w:sz w:val="20"/>
+      </w:rPr>
+    </w:lvl>
+  </w:abstractNum>
+  <w:abstractNum w:abstractNumId="3" w15:restartNumberingAfterBreak="0">
+    <w:nsid w:val="1D667D23"/>
+    <w:multiLevelType w:val="multilevel"/>
+    <w:tmpl w:val="2E0E5654"/>
+    <w:lvl w:ilvl="0">
+      <w:start w:val="1"/>
+      <w:numFmt w:val="bullet"/>
+      <w:lvlText w:val="-"/>
+      <w:lvlJc w:val="left"/>
+      <w:pPr>
+        <w:tabs>
+          <w:tab w:val="num" w:pos="1350"/>
+        </w:tabs>
+        <w:ind w:left="1350" w:hanging="360"/>
+      </w:pPr>
+      <w:rPr>
+        <w:rFonts w:ascii="Times New Roman" w:eastAsia="Times New Roman" w:hAnsi="Times New Roman" w:cs="Times New Roman" w:hint="default"/>
+        <w:sz w:val="20"/>
+      </w:rPr>
+    </w:lvl>
+    <w:lvl w:ilvl="1" w:tentative="1">
+      <w:start w:val="1"/>
+      <w:numFmt w:val="bullet"/>
+      <w:lvlText w:val="o"/>
+      <w:lvlJc w:val="left"/>
+      <w:pPr>
+        <w:tabs>
+          <w:tab w:val="num" w:pos="2070"/>
+        </w:tabs>
+        <w:ind w:left="2070" w:hanging="360"/>
+      </w:pPr>
+      <w:rPr>
+        <w:rFonts w:ascii="Courier New" w:hAnsi="Courier New" w:hint="default"/>
+        <w:sz w:val="20"/>
+      </w:rPr>
+    </w:lvl>
+    <w:lvl w:ilvl="2" w:tentative="1">
+      <w:start w:val="1"/>
+      <w:numFmt w:val="bullet"/>
+      <w:lvlText w:val=""/>
+      <w:lvlJc w:val="left"/>
+      <w:pPr>
+        <w:tabs>
+          <w:tab w:val="num" w:pos="2790"/>
+        </w:tabs>
+        <w:ind w:left="2790" w:hanging="360"/>
+      </w:pPr>
+      <w:rPr>
+        <w:rFonts w:ascii="Wingdings" w:hAnsi="Wingdings" w:hint="default"/>
+        <w:sz w:val="20"/>
+      </w:rPr>
+    </w:lvl>
+    <w:lvl w:ilvl="3" w:tentative="1">
+      <w:start w:val="1"/>
+      <w:numFmt w:val="bullet"/>
+      <w:lvlText w:val=""/>
+      <w:lvlJc w:val="left"/>
+      <w:pPr>
+        <w:tabs>
+          <w:tab w:val="num" w:pos="3510"/>
+        </w:tabs>
+        <w:ind w:left="3510" w:hanging="360"/>
+      </w:pPr>
+      <w:rPr>
+        <w:rFonts w:ascii="Wingdings" w:hAnsi="Wingdings" w:hint="default"/>
+        <w:sz w:val="20"/>
+      </w:rPr>
+    </w:lvl>
+    <w:lvl w:ilvl="4" w:tentative="1">
+      <w:start w:val="1"/>
+      <w:numFmt w:val="bullet"/>
+      <w:lvlText w:val=""/>
+      <w:lvlJc w:val="left"/>
+      <w:pPr>
+        <w:tabs>
+          <w:tab w:val="num" w:pos="4230"/>
+        </w:tabs>
+        <w:ind w:left="4230" w:hanging="360"/>
+      </w:pPr>
+      <w:rPr>
+        <w:rFonts w:ascii="Wingdings" w:hAnsi="Wingdings" w:hint="default"/>
+        <w:sz w:val="20"/>
+      </w:rPr>
+    </w:lvl>
+    <w:lvl w:ilvl="5" w:tentative="1">
+      <w:start w:val="1"/>
+      <w:numFmt w:val="bullet"/>
+      <w:lvlText w:val=""/>
+      <w:lvlJc w:val="left"/>
+      <w:pPr>
+        <w:tabs>
+          <w:tab w:val="num" w:pos="4950"/>
+        </w:tabs>
+        <w:ind w:left="4950" w:hanging="360"/>
+      </w:pPr>
+      <w:rPr>
+        <w:rFonts w:ascii="Wingdings" w:hAnsi="Wingdings" w:hint="default"/>
+        <w:sz w:val="20"/>
+      </w:rPr>
+    </w:lvl>
+    <w:lvl w:ilvl="6" w:tentative="1">
+      <w:start w:val="1"/>
+      <w:numFmt w:val="bullet"/>
+      <w:lvlText w:val=""/>
+      <w:lvlJc w:val="left"/>
+      <w:pPr>
+        <w:tabs>
+          <w:tab w:val="num" w:pos="5670"/>
+        </w:tabs>
+        <w:ind w:left="5670" w:hanging="360"/>
+      </w:pPr>
+      <w:rPr>
+        <w:rFonts w:ascii="Wingdings" w:hAnsi="Wingdings" w:hint="default"/>
+        <w:sz w:val="20"/>
+      </w:rPr>
+    </w:lvl>
+    <w:lvl w:ilvl="7" w:tentative="1">
+      <w:start w:val="1"/>
+      <w:numFmt w:val="bullet"/>
+      <w:lvlText w:val=""/>
+      <w:lvlJc w:val="left"/>
+      <w:pPr>
+        <w:tabs>
+          <w:tab w:val="num" w:pos="6390"/>
+        </w:tabs>
+        <w:ind w:left="6390" w:hanging="360"/>
+      </w:pPr>
+      <w:rPr>
+        <w:rFonts w:ascii="Wingdings" w:hAnsi="Wingdings" w:hint="default"/>
+        <w:sz w:val="20"/>
+      </w:rPr>
+    </w:lvl>
+    <w:lvl w:ilvl="8" w:tentative="1">
+      <w:start w:val="1"/>
+      <w:numFmt w:val="bullet"/>
+      <w:lvlText w:val=""/>
+      <w:lvlJc w:val="left"/>
+      <w:pPr>
+        <w:tabs>
+          <w:tab w:val="num" w:pos="7110"/>
+        </w:tabs>
+        <w:ind w:left="7110" w:hanging="360"/>
+      </w:pPr>
+      <w:rPr>
+        <w:rFonts w:ascii="Wingdings" w:hAnsi="Wingdings" w:hint="default"/>
+        <w:sz w:val="20"/>
+      </w:rPr>
+    </w:lvl>
+  </w:abstractNum>
+  <w:abstractNum w:abstractNumId="4" w15:restartNumberingAfterBreak="0">
+    <w:nsid w:val="1ECA5117"/>
+    <w:multiLevelType w:val="multilevel"/>
+    <w:tmpl w:val="964AF960"/>
+    <w:lvl w:ilvl="0">
+      <w:start w:val="1"/>
+      <w:numFmt w:val="bullet"/>
+      <w:lvlText w:val="-"/>
+      <w:lvlJc w:val="left"/>
+      <w:pPr>
+        <w:tabs>
+          <w:tab w:val="num" w:pos="1350"/>
+        </w:tabs>
+        <w:ind w:left="1350" w:hanging="360"/>
+      </w:pPr>
+      <w:rPr>
+        <w:rFonts w:ascii="Times New Roman" w:eastAsia="Times New Roman" w:hAnsi="Times New Roman" w:cs="Times New Roman" w:hint="default"/>
+        <w:sz w:val="20"/>
+      </w:rPr>
+    </w:lvl>
+    <w:lvl w:ilvl="1" w:tentative="1">
+      <w:start w:val="1"/>
+      <w:numFmt w:val="bullet"/>
+      <w:lvlText w:val="o"/>
+      <w:lvlJc w:val="left"/>
+      <w:pPr>
+        <w:tabs>
+          <w:tab w:val="num" w:pos="2070"/>
+        </w:tabs>
+        <w:ind w:left="2070" w:hanging="360"/>
+      </w:pPr>
+      <w:rPr>
+        <w:rFonts w:ascii="Courier New" w:hAnsi="Courier New" w:hint="default"/>
+        <w:sz w:val="20"/>
+      </w:rPr>
+    </w:lvl>
+    <w:lvl w:ilvl="2" w:tentative="1">
+      <w:start w:val="1"/>
+      <w:numFmt w:val="bullet"/>
+      <w:lvlText w:val=""/>
+      <w:lvlJc w:val="left"/>
+      <w:pPr>
+        <w:tabs>
+          <w:tab w:val="num" w:pos="2790"/>
+        </w:tabs>
+        <w:ind w:left="2790" w:hanging="360"/>
+      </w:pPr>
+      <w:rPr>
+        <w:rFonts w:ascii="Wingdings" w:hAnsi="Wingdings" w:hint="default"/>
+        <w:sz w:val="20"/>
+      </w:rPr>
+    </w:lvl>
+    <w:lvl w:ilvl="3" w:tentative="1">
+      <w:start w:val="1"/>
+      <w:numFmt w:val="bullet"/>
+      <w:lvlText w:val=""/>
+      <w:lvlJc w:val="left"/>
+      <w:pPr>
+        <w:tabs>
+          <w:tab w:val="num" w:pos="3510"/>
+        </w:tabs>
+        <w:ind w:left="3510" w:hanging="360"/>
+      </w:pPr>
+      <w:rPr>
+        <w:rFonts w:ascii="Wingdings" w:hAnsi="Wingdings" w:hint="default"/>
+        <w:sz w:val="20"/>
+      </w:rPr>
+    </w:lvl>
+    <w:lvl w:ilvl="4" w:tentative="1">
+      <w:start w:val="1"/>
+      <w:numFmt w:val="bullet"/>
+      <w:lvlText w:val=""/>
+      <w:lvlJc w:val="left"/>
+      <w:pPr>
+        <w:tabs>
+          <w:tab w:val="num" w:pos="4230"/>
+        </w:tabs>
+        <w:ind w:left="4230" w:hanging="360"/>
+      </w:pPr>
+      <w:rPr>
+        <w:rFonts w:ascii="Wingdings" w:hAnsi="Wingdings" w:hint="default"/>
+        <w:sz w:val="20"/>
+      </w:rPr>
+    </w:lvl>
+    <w:lvl w:ilvl="5" w:tentative="1">
+      <w:start w:val="1"/>
+      <w:numFmt w:val="bullet"/>
+      <w:lvlText w:val=""/>
+      <w:lvlJc w:val="left"/>
+      <w:pPr>
+        <w:tabs>
+          <w:tab w:val="num" w:pos="4950"/>
+        </w:tabs>
+        <w:ind w:left="4950" w:hanging="360"/>
+      </w:pPr>
+      <w:rPr>
+        <w:rFonts w:ascii="Wingdings" w:hAnsi="Wingdings" w:hint="default"/>
+        <w:sz w:val="20"/>
+      </w:rPr>
+    </w:lvl>
+    <w:lvl w:ilvl="6" w:tentative="1">
+      <w:start w:val="1"/>
+      <w:numFmt w:val="bullet"/>
+      <w:lvlText w:val=""/>
+      <w:lvlJc w:val="left"/>
+      <w:pPr>
+        <w:tabs>
+          <w:tab w:val="num" w:pos="5670"/>
+        </w:tabs>
+        <w:ind w:left="5670" w:hanging="360"/>
+      </w:pPr>
+      <w:rPr>
+        <w:rFonts w:ascii="Wingdings" w:hAnsi="Wingdings" w:hint="default"/>
+        <w:sz w:val="20"/>
+      </w:rPr>
+    </w:lvl>
+    <w:lvl w:ilvl="7" w:tentative="1">
+      <w:start w:val="1"/>
+      <w:numFmt w:val="bullet"/>
+      <w:lvlText w:val=""/>
+      <w:lvlJc w:val="left"/>
+      <w:pPr>
+        <w:tabs>
+          <w:tab w:val="num" w:pos="6390"/>
+        </w:tabs>
+        <w:ind w:left="6390" w:hanging="360"/>
+      </w:pPr>
+      <w:rPr>
+        <w:rFonts w:ascii="Wingdings" w:hAnsi="Wingdings" w:hint="default"/>
+        <w:sz w:val="20"/>
+      </w:rPr>
+    </w:lvl>
+    <w:lvl w:ilvl="8" w:tentative="1">
+      <w:start w:val="1"/>
+      <w:numFmt w:val="bullet"/>
+      <w:lvlText w:val=""/>
+      <w:lvlJc w:val="left"/>
+      <w:pPr>
+        <w:tabs>
+          <w:tab w:val="num" w:pos="7110"/>
+        </w:tabs>
+        <w:ind w:left="7110" w:hanging="360"/>
+      </w:pPr>
+      <w:rPr>
+        <w:rFonts w:ascii="Wingdings" w:hAnsi="Wingdings" w:hint="default"/>
+        <w:sz w:val="20"/>
+      </w:rPr>
+    </w:lvl>
+  </w:abstractNum>
+  <w:abstractNum w:abstractNumId="5" w15:restartNumberingAfterBreak="0">
+    <w:nsid w:val="326625D8"/>
+    <w:multiLevelType w:val="multilevel"/>
+    <w:tmpl w:val="0E22B3B8"/>
+    <w:lvl w:ilvl="0">
+      <w:start w:val="1"/>
+      <w:numFmt w:val="bullet"/>
+      <w:lvlText w:val="-"/>
+      <w:lvlJc w:val="left"/>
+      <w:pPr>
+        <w:tabs>
+          <w:tab w:val="num" w:pos="1350"/>
+        </w:tabs>
+        <w:ind w:left="1350" w:hanging="360"/>
+      </w:pPr>
+      <w:rPr>
+        <w:rFonts w:ascii="Times New Roman" w:eastAsia="Times New Roman" w:hAnsi="Times New Roman" w:cs="Times New Roman" w:hint="default"/>
+        <w:sz w:val="20"/>
+      </w:rPr>
+    </w:lvl>
+    <w:lvl w:ilvl="1" w:tentative="1">
+      <w:start w:val="1"/>
+      <w:numFmt w:val="bullet"/>
+      <w:lvlText w:val="o"/>
+      <w:lvlJc w:val="left"/>
+      <w:pPr>
+        <w:tabs>
+          <w:tab w:val="num" w:pos="2070"/>
+        </w:tabs>
+        <w:ind w:left="2070" w:hanging="360"/>
+      </w:pPr>
+      <w:rPr>
+        <w:rFonts w:ascii="Courier New" w:hAnsi="Courier New" w:hint="default"/>
+        <w:sz w:val="20"/>
+      </w:rPr>
+    </w:lvl>
+    <w:lvl w:ilvl="2" w:tentative="1">
+      <w:start w:val="1"/>
+      <w:numFmt w:val="bullet"/>
+      <w:lvlText w:val=""/>
+      <w:lvlJc w:val="left"/>
+      <w:pPr>
+        <w:tabs>
+          <w:tab w:val="num" w:pos="2790"/>
+        </w:tabs>
+        <w:ind w:left="2790" w:hanging="360"/>
+      </w:pPr>
+      <w:rPr>
+        <w:rFonts w:ascii="Wingdings" w:hAnsi="Wingdings" w:hint="default"/>
+        <w:sz w:val="20"/>
+      </w:rPr>
+    </w:lvl>
+    <w:lvl w:ilvl="3" w:tentative="1">
+      <w:start w:val="1"/>
+      <w:numFmt w:val="bullet"/>
+      <w:lvlText w:val=""/>
+      <w:lvlJc w:val="left"/>
+      <w:pPr>
+        <w:tabs>
+          <w:tab w:val="num" w:pos="3510"/>
+        </w:tabs>
+        <w:ind w:left="3510" w:hanging="360"/>
+      </w:pPr>
+      <w:rPr>
+        <w:rFonts w:ascii="Wingdings" w:hAnsi="Wingdings" w:hint="default"/>
+        <w:sz w:val="20"/>
+      </w:rPr>
+    </w:lvl>
+    <w:lvl w:ilvl="4" w:tentative="1">
+      <w:start w:val="1"/>
+      <w:numFmt w:val="bullet"/>
+      <w:lvlText w:val=""/>
+      <w:lvlJc w:val="left"/>
+      <w:pPr>
+        <w:tabs>
+          <w:tab w:val="num" w:pos="4230"/>
+        </w:tabs>
+        <w:ind w:left="4230" w:hanging="360"/>
+      </w:pPr>
+      <w:rPr>
+        <w:rFonts w:ascii="Wingdings" w:hAnsi="Wingdings" w:hint="default"/>
+        <w:sz w:val="20"/>
+      </w:rPr>
+    </w:lvl>
+    <w:lvl w:ilvl="5" w:tentative="1">
+      <w:start w:val="1"/>
+      <w:numFmt w:val="bullet"/>
+      <w:lvlText w:val=""/>
+      <w:lvlJc w:val="left"/>
+      <w:pPr>
+        <w:tabs>
+          <w:tab w:val="num" w:pos="4950"/>
+        </w:tabs>
+        <w:ind w:left="4950" w:hanging="360"/>
+      </w:pPr>
+      <w:rPr>
+        <w:rFonts w:ascii="Wingdings" w:hAnsi="Wingdings" w:hint="default"/>
+        <w:sz w:val="20"/>
+      </w:rPr>
+    </w:lvl>
+    <w:lvl w:ilvl="6" w:tentative="1">
+      <w:start w:val="1"/>
+      <w:numFmt w:val="bullet"/>
+      <w:lvlText w:val=""/>
+      <w:lvlJc w:val="left"/>
+      <w:pPr>
+        <w:tabs>
+          <w:tab w:val="num" w:pos="5670"/>
+        </w:tabs>
+        <w:ind w:left="5670" w:hanging="360"/>
+      </w:pPr>
+      <w:rPr>
+        <w:rFonts w:ascii="Wingdings" w:hAnsi="Wingdings" w:hint="default"/>
+        <w:sz w:val="20"/>
+      </w:rPr>
+    </w:lvl>
+    <w:lvl w:ilvl="7" w:tentative="1">
+      <w:start w:val="1"/>
+      <w:numFmt w:val="bullet"/>
+      <w:lvlText w:val=""/>
+      <w:lvlJc w:val="left"/>
+      <w:pPr>
+        <w:tabs>
+          <w:tab w:val="num" w:pos="6390"/>
+        </w:tabs>
+        <w:ind w:left="6390" w:hanging="360"/>
+      </w:pPr>
+      <w:rPr>
+        <w:rFonts w:ascii="Wingdings" w:hAnsi="Wingdings" w:hint="default"/>
+        <w:sz w:val="20"/>
+      </w:rPr>
+    </w:lvl>
+    <w:lvl w:ilvl="8" w:tentative="1">
+      <w:start w:val="1"/>
+      <w:numFmt w:val="bullet"/>
+      <w:lvlText w:val=""/>
+      <w:lvlJc w:val="left"/>
+      <w:pPr>
+        <w:tabs>
+          <w:tab w:val="num" w:pos="7110"/>
+        </w:tabs>
+        <w:ind w:left="7110" w:hanging="360"/>
+      </w:pPr>
+      <w:rPr>
+        <w:rFonts w:ascii="Wingdings" w:hAnsi="Wingdings" w:hint="default"/>
+        <w:sz w:val="20"/>
+      </w:rPr>
+    </w:lvl>
+  </w:abstractNum>
+  <w:abstractNum w:abstractNumId="6" w15:restartNumberingAfterBreak="0">
+    <w:nsid w:val="373C35AD"/>
+    <w:multiLevelType w:val="multilevel"/>
+    <w:tmpl w:val="F0C8C314"/>
+    <w:lvl w:ilvl="0">
+      <w:start w:val="1"/>
+      <w:numFmt w:val="bullet"/>
+      <w:lvlText w:val="-"/>
+      <w:lvlJc w:val="left"/>
+      <w:pPr>
+        <w:tabs>
+          <w:tab w:val="num" w:pos="1350"/>
+        </w:tabs>
+        <w:ind w:left="1350" w:hanging="360"/>
+      </w:pPr>
+      <w:rPr>
+        <w:rFonts w:ascii="Times New Roman" w:eastAsia="Times New Roman" w:hAnsi="Times New Roman" w:cs="Times New Roman" w:hint="default"/>
+        <w:sz w:val="20"/>
+      </w:rPr>
+    </w:lvl>
+    <w:lvl w:ilvl="1" w:tentative="1">
+      <w:start w:val="1"/>
+      <w:numFmt w:val="bullet"/>
+      <w:lvlText w:val="o"/>
+      <w:lvlJc w:val="left"/>
+      <w:pPr>
+        <w:tabs>
+          <w:tab w:val="num" w:pos="2070"/>
+        </w:tabs>
+        <w:ind w:left="2070" w:hanging="360"/>
+      </w:pPr>
+      <w:rPr>
+        <w:rFonts w:ascii="Courier New" w:hAnsi="Courier New" w:hint="default"/>
+        <w:sz w:val="20"/>
+      </w:rPr>
+    </w:lvl>
+    <w:lvl w:ilvl="2" w:tentative="1">
+      <w:start w:val="1"/>
+      <w:numFmt w:val="bullet"/>
+      <w:lvlText w:val=""/>
+      <w:lvlJc w:val="left"/>
+      <w:pPr>
+        <w:tabs>
+          <w:tab w:val="num" w:pos="2790"/>
+        </w:tabs>
+        <w:ind w:left="2790" w:hanging="360"/>
+      </w:pPr>
+      <w:rPr>
+        <w:rFonts w:ascii="Wingdings" w:hAnsi="Wingdings" w:hint="default"/>
+        <w:sz w:val="20"/>
+      </w:rPr>
+    </w:lvl>
+    <w:lvl w:ilvl="3" w:tentative="1">
+      <w:start w:val="1"/>
+      <w:numFmt w:val="bullet"/>
+      <w:lvlText w:val=""/>
+      <w:lvlJc w:val="left"/>
+      <w:pPr>
+        <w:tabs>
+          <w:tab w:val="num" w:pos="3510"/>
+        </w:tabs>
+        <w:ind w:left="3510" w:hanging="360"/>
+      </w:pPr>
+      <w:rPr>
+        <w:rFonts w:ascii="Wingdings" w:hAnsi="Wingdings" w:hint="default"/>
+        <w:sz w:val="20"/>
+      </w:rPr>
+    </w:lvl>
+    <w:lvl w:ilvl="4" w:tentative="1">
+      <w:start w:val="1"/>
+      <w:numFmt w:val="bullet"/>
+      <w:lvlText w:val=""/>
+      <w:lvlJc w:val="left"/>
+      <w:pPr>
+        <w:tabs>
+          <w:tab w:val="num" w:pos="4230"/>
+        </w:tabs>
+        <w:ind w:left="4230" w:hanging="360"/>
+      </w:pPr>
+      <w:rPr>
+        <w:rFonts w:ascii="Wingdings" w:hAnsi="Wingdings" w:hint="default"/>
+        <w:sz w:val="20"/>
+      </w:rPr>
+    </w:lvl>
+    <w:lvl w:ilvl="5" w:tentative="1">
+      <w:start w:val="1"/>
+      <w:numFmt w:val="bullet"/>
+      <w:lvlText w:val=""/>
+      <w:lvlJc w:val="left"/>
+      <w:pPr>
+        <w:tabs>
+          <w:tab w:val="num" w:pos="4950"/>
+        </w:tabs>
+        <w:ind w:left="4950" w:hanging="360"/>
+      </w:pPr>
+      <w:rPr>
+        <w:rFonts w:ascii="Wingdings" w:hAnsi="Wingdings" w:hint="default"/>
+        <w:sz w:val="20"/>
+      </w:rPr>
+    </w:lvl>
+    <w:lvl w:ilvl="6" w:tentative="1">
+      <w:start w:val="1"/>
+      <w:numFmt w:val="bullet"/>
+      <w:lvlText w:val=""/>
+      <w:lvlJc w:val="left"/>
+      <w:pPr>
+        <w:tabs>
+          <w:tab w:val="num" w:pos="5670"/>
+        </w:tabs>
+        <w:ind w:left="5670" w:hanging="360"/>
+      </w:pPr>
+      <w:rPr>
+        <w:rFonts w:ascii="Wingdings" w:hAnsi="Wingdings" w:hint="default"/>
+        <w:sz w:val="20"/>
+      </w:rPr>
+    </w:lvl>
+    <w:lvl w:ilvl="7" w:tentative="1">
+      <w:start w:val="1"/>
+      <w:numFmt w:val="bullet"/>
+      <w:lvlText w:val=""/>
+      <w:lvlJc w:val="left"/>
+      <w:pPr>
+        <w:tabs>
+          <w:tab w:val="num" w:pos="6390"/>
+        </w:tabs>
+        <w:ind w:left="6390" w:hanging="360"/>
+      </w:pPr>
+      <w:rPr>
+        <w:rFonts w:ascii="Wingdings" w:hAnsi="Wingdings" w:hint="default"/>
+        <w:sz w:val="20"/>
+      </w:rPr>
+    </w:lvl>
+    <w:lvl w:ilvl="8" w:tentative="1">
+      <w:start w:val="1"/>
+      <w:numFmt w:val="bullet"/>
+      <w:lvlText w:val=""/>
+      <w:lvlJc w:val="left"/>
+      <w:pPr>
+        <w:tabs>
+          <w:tab w:val="num" w:pos="7110"/>
+        </w:tabs>
+        <w:ind w:left="7110" w:hanging="360"/>
+      </w:pPr>
+      <w:rPr>
+        <w:rFonts w:ascii="Wingdings" w:hAnsi="Wingdings" w:hint="default"/>
+        <w:sz w:val="20"/>
+      </w:rPr>
+    </w:lvl>
+  </w:abstractNum>
+  <w:abstractNum w:abstractNumId="7" w15:restartNumberingAfterBreak="0">
+    <w:nsid w:val="3BAD23EB"/>
+    <w:multiLevelType w:val="multilevel"/>
+    <w:tmpl w:val="6F9C3DE2"/>
+    <w:lvl w:ilvl="0">
+      <w:start w:val="1"/>
+      <w:numFmt w:val="bullet"/>
+      <w:lvlText w:val="-"/>
+      <w:lvlJc w:val="left"/>
+      <w:pPr>
+        <w:tabs>
+          <w:tab w:val="num" w:pos="1350"/>
+        </w:tabs>
+        <w:ind w:left="1350" w:hanging="360"/>
+      </w:pPr>
+      <w:rPr>
+        <w:rFonts w:ascii="Times New Roman" w:eastAsia="Times New Roman" w:hAnsi="Times New Roman" w:cs="Times New Roman" w:hint="default"/>
+        <w:sz w:val="20"/>
+      </w:rPr>
+    </w:lvl>
+    <w:lvl w:ilvl="1" w:tentative="1">
+      <w:start w:val="1"/>
+      <w:numFmt w:val="bullet"/>
+      <w:lvlText w:val="o"/>
+      <w:lvlJc w:val="left"/>
+      <w:pPr>
+        <w:tabs>
+          <w:tab w:val="num" w:pos="2070"/>
+        </w:tabs>
+        <w:ind w:left="2070" w:hanging="360"/>
+      </w:pPr>
+      <w:rPr>
+        <w:rFonts w:ascii="Courier New" w:hAnsi="Courier New" w:hint="default"/>
+        <w:sz w:val="20"/>
+      </w:rPr>
+    </w:lvl>
+    <w:lvl w:ilvl="2" w:tentative="1">
+      <w:start w:val="1"/>
+      <w:numFmt w:val="bullet"/>
+      <w:lvlText w:val=""/>
+      <w:lvlJc w:val="left"/>
+      <w:pPr>
+        <w:tabs>
+          <w:tab w:val="num" w:pos="2790"/>
+        </w:tabs>
+        <w:ind w:left="2790" w:hanging="360"/>
+      </w:pPr>
+      <w:rPr>
+        <w:rFonts w:ascii="Wingdings" w:hAnsi="Wingdings" w:hint="default"/>
+        <w:sz w:val="20"/>
+      </w:rPr>
+    </w:lvl>
+    <w:lvl w:ilvl="3" w:tentative="1">
+      <w:start w:val="1"/>
+      <w:numFmt w:val="bullet"/>
+      <w:lvlText w:val=""/>
+      <w:lvlJc w:val="left"/>
+      <w:pPr>
+        <w:tabs>
+          <w:tab w:val="num" w:pos="3510"/>
+        </w:tabs>
+        <w:ind w:left="3510" w:hanging="360"/>
+      </w:pPr>
+      <w:rPr>
+        <w:rFonts w:ascii="Wingdings" w:hAnsi="Wingdings" w:hint="default"/>
+        <w:sz w:val="20"/>
+      </w:rPr>
+    </w:lvl>
+    <w:lvl w:ilvl="4" w:tentative="1">
+      <w:start w:val="1"/>
+      <w:numFmt w:val="bullet"/>
+      <w:lvlText w:val=""/>
+      <w:lvlJc w:val="left"/>
+      <w:pPr>
+        <w:tabs>
+          <w:tab w:val="num" w:pos="4230"/>
+        </w:tabs>
+        <w:ind w:left="4230" w:hanging="360"/>
+      </w:pPr>
+      <w:rPr>
+        <w:rFonts w:ascii="Wingdings" w:hAnsi="Wingdings" w:hint="default"/>
+        <w:sz w:val="20"/>
+      </w:rPr>
+    </w:lvl>
+    <w:lvl w:ilvl="5" w:tentative="1">
+      <w:start w:val="1"/>
+      <w:numFmt w:val="bullet"/>
+      <w:lvlText w:val=""/>
+      <w:lvlJc w:val="left"/>
+      <w:pPr>
+        <w:tabs>
+          <w:tab w:val="num" w:pos="4950"/>
+        </w:tabs>
+        <w:ind w:left="4950" w:hanging="360"/>
+      </w:pPr>
+      <w:rPr>
+        <w:rFonts w:ascii="Wingdings" w:hAnsi="Wingdings" w:hint="default"/>
+        <w:sz w:val="20"/>
+      </w:rPr>
+    </w:lvl>
+    <w:lvl w:ilvl="6" w:tentative="1">
+      <w:start w:val="1"/>
+      <w:numFmt w:val="bullet"/>
+      <w:lvlText w:val=""/>
+      <w:lvlJc w:val="left"/>
+      <w:pPr>
+        <w:tabs>
+          <w:tab w:val="num" w:pos="5670"/>
+        </w:tabs>
+        <w:ind w:left="5670" w:hanging="360"/>
+      </w:pPr>
+      <w:rPr>
+        <w:rFonts w:ascii="Wingdings" w:hAnsi="Wingdings" w:hint="default"/>
+        <w:sz w:val="20"/>
+      </w:rPr>
+    </w:lvl>
+    <w:lvl w:ilvl="7" w:tentative="1">
+      <w:start w:val="1"/>
+      <w:numFmt w:val="bullet"/>
+      <w:lvlText w:val=""/>
+      <w:lvlJc w:val="left"/>
+      <w:pPr>
+        <w:tabs>
+          <w:tab w:val="num" w:pos="6390"/>
+        </w:tabs>
+        <w:ind w:left="6390" w:hanging="360"/>
+      </w:pPr>
+      <w:rPr>
+        <w:rFonts w:ascii="Wingdings" w:hAnsi="Wingdings" w:hint="default"/>
+        <w:sz w:val="20"/>
+      </w:rPr>
+    </w:lvl>
+    <w:lvl w:ilvl="8" w:tentative="1">
+      <w:start w:val="1"/>
+      <w:numFmt w:val="bullet"/>
+      <w:lvlText w:val=""/>
+      <w:lvlJc w:val="left"/>
+      <w:pPr>
+        <w:tabs>
+          <w:tab w:val="num" w:pos="7110"/>
+        </w:tabs>
+        <w:ind w:left="7110" w:hanging="360"/>
+      </w:pPr>
+      <w:rPr>
+        <w:rFonts w:ascii="Wingdings" w:hAnsi="Wingdings" w:hint="default"/>
+        <w:sz w:val="20"/>
+      </w:rPr>
+    </w:lvl>
+  </w:abstractNum>
+  <w:abstractNum w:abstractNumId="8" w15:restartNumberingAfterBreak="0">
     <w:nsid w:val="46E6266F"/>
     <w:multiLevelType w:val="hybridMultilevel"/>
     <w:tmpl w:val="9A2E648C"/>
@@ -15483,7 +17058,156 @@
       </w:rPr>
     </w:lvl>
   </w:abstractNum>
-  <w:abstractNum w:abstractNumId="3" w15:restartNumberingAfterBreak="0">
+  <w:abstractNum w:abstractNumId="9" w15:restartNumberingAfterBreak="0">
+    <w:nsid w:val="4C3A0344"/>
+    <w:multiLevelType w:val="multilevel"/>
+    <w:tmpl w:val="9A10FB20"/>
+    <w:lvl w:ilvl="0">
+      <w:start w:val="1"/>
+      <w:numFmt w:val="bullet"/>
+      <w:lvlText w:val="-"/>
+      <w:lvlJc w:val="left"/>
+      <w:pPr>
+        <w:tabs>
+          <w:tab w:val="num" w:pos="1350"/>
+        </w:tabs>
+        <w:ind w:left="1350" w:hanging="360"/>
+      </w:pPr>
+      <w:rPr>
+        <w:rFonts w:ascii="Times New Roman" w:eastAsia="Times New Roman" w:hAnsi="Times New Roman" w:cs="Times New Roman" w:hint="default"/>
+        <w:sz w:val="20"/>
+      </w:rPr>
+    </w:lvl>
+    <w:lvl w:ilvl="1" w:tentative="1">
+      <w:start w:val="1"/>
+      <w:numFmt w:val="bullet"/>
+      <w:lvlText w:val="o"/>
+      <w:lvlJc w:val="left"/>
+      <w:pPr>
+        <w:tabs>
+          <w:tab w:val="num" w:pos="2070"/>
+        </w:tabs>
+        <w:ind w:left="2070" w:hanging="360"/>
+      </w:pPr>
+      <w:rPr>
+        <w:rFonts w:ascii="Courier New" w:hAnsi="Courier New" w:hint="default"/>
+        <w:sz w:val="20"/>
+      </w:rPr>
+    </w:lvl>
+    <w:lvl w:ilvl="2" w:tentative="1">
+      <w:start w:val="1"/>
+      <w:numFmt w:val="bullet"/>
+      <w:lvlText w:val=""/>
+      <w:lvlJc w:val="left"/>
+      <w:pPr>
+        <w:tabs>
+          <w:tab w:val="num" w:pos="2790"/>
+        </w:tabs>
+        <w:ind w:left="2790" w:hanging="360"/>
+      </w:pPr>
+      <w:rPr>
+        <w:rFonts w:ascii="Wingdings" w:hAnsi="Wingdings" w:hint="default"/>
+        <w:sz w:val="20"/>
+      </w:rPr>
+    </w:lvl>
+    <w:lvl w:ilvl="3" w:tentative="1">
+      <w:start w:val="1"/>
+      <w:numFmt w:val="bullet"/>
+      <w:lvlText w:val=""/>
+      <w:lvlJc w:val="left"/>
+      <w:pPr>
+        <w:tabs>
+          <w:tab w:val="num" w:pos="3510"/>
+        </w:tabs>
+        <w:ind w:left="3510" w:hanging="360"/>
+      </w:pPr>
+      <w:rPr>
+        <w:rFonts w:ascii="Wingdings" w:hAnsi="Wingdings" w:hint="default"/>
+        <w:sz w:val="20"/>
+      </w:rPr>
+    </w:lvl>
+    <w:lvl w:ilvl="4" w:tentative="1">
+      <w:start w:val="1"/>
+      <w:numFmt w:val="bullet"/>
+      <w:lvlText w:val=""/>
+      <w:lvlJc w:val="left"/>
+      <w:pPr>
+        <w:tabs>
+          <w:tab w:val="num" w:pos="4230"/>
+        </w:tabs>
+        <w:ind w:left="4230" w:hanging="360"/>
+      </w:pPr>
+      <w:rPr>
+        <w:rFonts w:ascii="Wingdings" w:hAnsi="Wingdings" w:hint="default"/>
+        <w:sz w:val="20"/>
+      </w:rPr>
+    </w:lvl>
+    <w:lvl w:ilvl="5" w:tentative="1">
+      <w:start w:val="1"/>
+      <w:numFmt w:val="bullet"/>
+      <w:lvlText w:val=""/>
+      <w:lvlJc w:val="left"/>
+      <w:pPr>
+        <w:tabs>
+          <w:tab w:val="num" w:pos="4950"/>
+        </w:tabs>
+        <w:ind w:left="4950" w:hanging="360"/>
+      </w:pPr>
+      <w:rPr>
+        <w:rFonts w:ascii="Wingdings" w:hAnsi="Wingdings" w:hint="default"/>
+        <w:sz w:val="20"/>
+      </w:rPr>
+    </w:lvl>
+    <w:lvl w:ilvl="6" w:tentative="1">
+      <w:start w:val="1"/>
+      <w:numFmt w:val="bullet"/>
+      <w:lvlText w:val=""/>
+      <w:lvlJc w:val="left"/>
+      <w:pPr>
+        <w:tabs>
+          <w:tab w:val="num" w:pos="5670"/>
+        </w:tabs>
+        <w:ind w:left="5670" w:hanging="360"/>
+      </w:pPr>
+      <w:rPr>
+        <w:rFonts w:ascii="Wingdings" w:hAnsi="Wingdings" w:hint="default"/>
+        <w:sz w:val="20"/>
+      </w:rPr>
+    </w:lvl>
+    <w:lvl w:ilvl="7" w:tentative="1">
+      <w:start w:val="1"/>
+      <w:numFmt w:val="bullet"/>
+      <w:lvlText w:val=""/>
+      <w:lvlJc w:val="left"/>
+      <w:pPr>
+        <w:tabs>
+          <w:tab w:val="num" w:pos="6390"/>
+        </w:tabs>
+        <w:ind w:left="6390" w:hanging="360"/>
+      </w:pPr>
+      <w:rPr>
+        <w:rFonts w:ascii="Wingdings" w:hAnsi="Wingdings" w:hint="default"/>
+        <w:sz w:val="20"/>
+      </w:rPr>
+    </w:lvl>
+    <w:lvl w:ilvl="8" w:tentative="1">
+      <w:start w:val="1"/>
+      <w:numFmt w:val="bullet"/>
+      <w:lvlText w:val=""/>
+      <w:lvlJc w:val="left"/>
+      <w:pPr>
+        <w:tabs>
+          <w:tab w:val="num" w:pos="7110"/>
+        </w:tabs>
+        <w:ind w:left="7110" w:hanging="360"/>
+      </w:pPr>
+      <w:rPr>
+        <w:rFonts w:ascii="Wingdings" w:hAnsi="Wingdings" w:hint="default"/>
+        <w:sz w:val="20"/>
+      </w:rPr>
+    </w:lvl>
+  </w:abstractNum>
+  <w:abstractNum w:abstractNumId="10" w15:restartNumberingAfterBreak="0">
     <w:nsid w:val="4D5C098A"/>
     <w:multiLevelType w:val="hybridMultilevel"/>
     <w:tmpl w:val="95985ECE"/>
@@ -15574,7 +17298,156 @@
       </w:pPr>
     </w:lvl>
   </w:abstractNum>
-  <w:abstractNum w:abstractNumId="4" w15:restartNumberingAfterBreak="0">
+  <w:abstractNum w:abstractNumId="11" w15:restartNumberingAfterBreak="0">
+    <w:nsid w:val="57EA0620"/>
+    <w:multiLevelType w:val="multilevel"/>
+    <w:tmpl w:val="9EE8BA1E"/>
+    <w:lvl w:ilvl="0">
+      <w:start w:val="1"/>
+      <w:numFmt w:val="bullet"/>
+      <w:lvlText w:val="-"/>
+      <w:lvlJc w:val="left"/>
+      <w:pPr>
+        <w:tabs>
+          <w:tab w:val="num" w:pos="1350"/>
+        </w:tabs>
+        <w:ind w:left="1350" w:hanging="360"/>
+      </w:pPr>
+      <w:rPr>
+        <w:rFonts w:ascii="Times New Roman" w:eastAsia="Times New Roman" w:hAnsi="Times New Roman" w:cs="Times New Roman" w:hint="default"/>
+        <w:sz w:val="20"/>
+      </w:rPr>
+    </w:lvl>
+    <w:lvl w:ilvl="1" w:tentative="1">
+      <w:start w:val="1"/>
+      <w:numFmt w:val="bullet"/>
+      <w:lvlText w:val="o"/>
+      <w:lvlJc w:val="left"/>
+      <w:pPr>
+        <w:tabs>
+          <w:tab w:val="num" w:pos="2070"/>
+        </w:tabs>
+        <w:ind w:left="2070" w:hanging="360"/>
+      </w:pPr>
+      <w:rPr>
+        <w:rFonts w:ascii="Courier New" w:hAnsi="Courier New" w:hint="default"/>
+        <w:sz w:val="20"/>
+      </w:rPr>
+    </w:lvl>
+    <w:lvl w:ilvl="2" w:tentative="1">
+      <w:start w:val="1"/>
+      <w:numFmt w:val="bullet"/>
+      <w:lvlText w:val=""/>
+      <w:lvlJc w:val="left"/>
+      <w:pPr>
+        <w:tabs>
+          <w:tab w:val="num" w:pos="2790"/>
+        </w:tabs>
+        <w:ind w:left="2790" w:hanging="360"/>
+      </w:pPr>
+      <w:rPr>
+        <w:rFonts w:ascii="Wingdings" w:hAnsi="Wingdings" w:hint="default"/>
+        <w:sz w:val="20"/>
+      </w:rPr>
+    </w:lvl>
+    <w:lvl w:ilvl="3" w:tentative="1">
+      <w:start w:val="1"/>
+      <w:numFmt w:val="bullet"/>
+      <w:lvlText w:val=""/>
+      <w:lvlJc w:val="left"/>
+      <w:pPr>
+        <w:tabs>
+          <w:tab w:val="num" w:pos="3510"/>
+        </w:tabs>
+        <w:ind w:left="3510" w:hanging="360"/>
+      </w:pPr>
+      <w:rPr>
+        <w:rFonts w:ascii="Wingdings" w:hAnsi="Wingdings" w:hint="default"/>
+        <w:sz w:val="20"/>
+      </w:rPr>
+    </w:lvl>
+    <w:lvl w:ilvl="4" w:tentative="1">
+      <w:start w:val="1"/>
+      <w:numFmt w:val="bullet"/>
+      <w:lvlText w:val=""/>
+      <w:lvlJc w:val="left"/>
+      <w:pPr>
+        <w:tabs>
+          <w:tab w:val="num" w:pos="4230"/>
+        </w:tabs>
+        <w:ind w:left="4230" w:hanging="360"/>
+      </w:pPr>
+      <w:rPr>
+        <w:rFonts w:ascii="Wingdings" w:hAnsi="Wingdings" w:hint="default"/>
+        <w:sz w:val="20"/>
+      </w:rPr>
+    </w:lvl>
+    <w:lvl w:ilvl="5" w:tentative="1">
+      <w:start w:val="1"/>
+      <w:numFmt w:val="bullet"/>
+      <w:lvlText w:val=""/>
+      <w:lvlJc w:val="left"/>
+      <w:pPr>
+        <w:tabs>
+          <w:tab w:val="num" w:pos="4950"/>
+        </w:tabs>
+        <w:ind w:left="4950" w:hanging="360"/>
+      </w:pPr>
+      <w:rPr>
+        <w:rFonts w:ascii="Wingdings" w:hAnsi="Wingdings" w:hint="default"/>
+        <w:sz w:val="20"/>
+      </w:rPr>
+    </w:lvl>
+    <w:lvl w:ilvl="6" w:tentative="1">
+      <w:start w:val="1"/>
+      <w:numFmt w:val="bullet"/>
+      <w:lvlText w:val=""/>
+      <w:lvlJc w:val="left"/>
+      <w:pPr>
+        <w:tabs>
+          <w:tab w:val="num" w:pos="5670"/>
+        </w:tabs>
+        <w:ind w:left="5670" w:hanging="360"/>
+      </w:pPr>
+      <w:rPr>
+        <w:rFonts w:ascii="Wingdings" w:hAnsi="Wingdings" w:hint="default"/>
+        <w:sz w:val="20"/>
+      </w:rPr>
+    </w:lvl>
+    <w:lvl w:ilvl="7" w:tentative="1">
+      <w:start w:val="1"/>
+      <w:numFmt w:val="bullet"/>
+      <w:lvlText w:val=""/>
+      <w:lvlJc w:val="left"/>
+      <w:pPr>
+        <w:tabs>
+          <w:tab w:val="num" w:pos="6390"/>
+        </w:tabs>
+        <w:ind w:left="6390" w:hanging="360"/>
+      </w:pPr>
+      <w:rPr>
+        <w:rFonts w:ascii="Wingdings" w:hAnsi="Wingdings" w:hint="default"/>
+        <w:sz w:val="20"/>
+      </w:rPr>
+    </w:lvl>
+    <w:lvl w:ilvl="8" w:tentative="1">
+      <w:start w:val="1"/>
+      <w:numFmt w:val="bullet"/>
+      <w:lvlText w:val=""/>
+      <w:lvlJc w:val="left"/>
+      <w:pPr>
+        <w:tabs>
+          <w:tab w:val="num" w:pos="7110"/>
+        </w:tabs>
+        <w:ind w:left="7110" w:hanging="360"/>
+      </w:pPr>
+      <w:rPr>
+        <w:rFonts w:ascii="Wingdings" w:hAnsi="Wingdings" w:hint="default"/>
+        <w:sz w:val="20"/>
+      </w:rPr>
+    </w:lvl>
+  </w:abstractNum>
+  <w:abstractNum w:abstractNumId="12" w15:restartNumberingAfterBreak="0">
     <w:nsid w:val="678F230B"/>
     <w:multiLevelType w:val="hybridMultilevel"/>
     <w:tmpl w:val="D4F2EBBE"/>
@@ -15665,7 +17538,7 @@
       </w:pPr>
     </w:lvl>
   </w:abstractNum>
-  <w:abstractNum w:abstractNumId="5" w15:restartNumberingAfterBreak="0">
+  <w:abstractNum w:abstractNumId="13" w15:restartNumberingAfterBreak="0">
     <w:nsid w:val="772815DD"/>
     <w:multiLevelType w:val="hybridMultilevel"/>
     <w:tmpl w:val="D4626B72"/>
@@ -15778,10 +17651,10 @@
     </w:lvl>
   </w:abstractNum>
   <w:num w:numId="1" w16cid:durableId="2021348451">
-    <w:abstractNumId w:val="3"/>
+    <w:abstractNumId w:val="10"/>
   </w:num>
   <w:num w:numId="2" w16cid:durableId="591088944">
-    <w:abstractNumId w:val="4"/>
+    <w:abstractNumId w:val="12"/>
   </w:num>
   <w:num w:numId="3" w16cid:durableId="941257521">
     <w:abstractNumId w:val="0"/>
@@ -15907,13 +17780,37 @@
     </w:lvlOverride>
   </w:num>
   <w:num w:numId="8" w16cid:durableId="1277642441">
+    <w:abstractNumId w:val="13"/>
+  </w:num>
+  <w:num w:numId="9" w16cid:durableId="913590838">
+    <w:abstractNumId w:val="8"/>
+  </w:num>
+  <w:num w:numId="10" w16cid:durableId="590701889">
+    <w:abstractNumId w:val="3"/>
+  </w:num>
+  <w:num w:numId="11" w16cid:durableId="1561479629">
+    <w:abstractNumId w:val="6"/>
+  </w:num>
+  <w:num w:numId="12" w16cid:durableId="801310313">
+    <w:abstractNumId w:val="11"/>
+  </w:num>
+  <w:num w:numId="13" w16cid:durableId="1106268487">
+    <w:abstractNumId w:val="2"/>
+  </w:num>
+  <w:num w:numId="14" w16cid:durableId="759066369">
+    <w:abstractNumId w:val="9"/>
+  </w:num>
+  <w:num w:numId="15" w16cid:durableId="2106995405">
+    <w:abstractNumId w:val="1"/>
+  </w:num>
+  <w:num w:numId="16" w16cid:durableId="1266110323">
     <w:abstractNumId w:val="5"/>
   </w:num>
-  <w:num w:numId="9" w16cid:durableId="913590838">
-    <w:abstractNumId w:val="2"/>
+  <w:num w:numId="17" w16cid:durableId="1921331376">
+    <w:abstractNumId w:val="7"/>
   </w:num>
-  <w:num w:numId="10" w16cid:durableId="590701889">
-    <w:abstractNumId w:val="1"/>
+  <w:num w:numId="18" w16cid:durableId="1725912091">
+    <w:abstractNumId w:val="4"/>
   </w:num>
   <w:numIdMacAtCleanup w:val="9"/>
 </w:numbering>

</xml_diff>